<commit_message>
Update CV, Cover Page, and Joining Letter according to exact YouTube video and BTEB Job Sheet specifications
</commit_message>
<xml_diff>
--- a/Job_Sheet_CV_Template.docx
+++ b/Job_Sheet_CV_Template.docx
@@ -2,269 +2,122 @@
 <file path=word/document.xml><?xml version="1.0" encoding="utf-8"?>
 <w:document xmlns:wpc="http://schemas.microsoft.com/office/word/2010/wordprocessingCanvas" xmlns:mo="http://schemas.microsoft.com/office/mac/office/2008/main" xmlns:mc="http://schemas.openxmlformats.org/markup-compatibility/2006" xmlns:mv="urn:schemas-microsoft-com:mac:vml" xmlns:o="urn:schemas-microsoft-com:office:office" xmlns:r="http://schemas.openxmlformats.org/officeDocument/2006/relationships" xmlns:m="http://schemas.openxmlformats.org/officeDocument/2006/math" xmlns:v="urn:schemas-microsoft-com:vml" xmlns:wp14="http://schemas.microsoft.com/office/word/2010/wordprocessingDrawing" xmlns:wp="http://schemas.openxmlformats.org/drawingml/2006/wordprocessingDrawing" xmlns:w10="urn:schemas-microsoft-com:office:word" xmlns:w="http://schemas.openxmlformats.org/wordprocessingml/2006/main" xmlns:w14="http://schemas.microsoft.com/office/word/2010/wordml" xmlns:wpg="http://schemas.microsoft.com/office/word/2010/wordprocessingGroup" xmlns:wpi="http://schemas.microsoft.com/office/word/2010/wordprocessingInk" xmlns:wne="http://schemas.microsoft.com/office/word/2006/wordml" xmlns:wps="http://schemas.microsoft.com/office/word/2010/wordprocessingShape" mc:Ignorable="w14 wp14">
   <w:body>
+    <w:tbl>
+      <w:tblPr>
+        <w:tblW w:type="auto" w:w="0"/>
+        <w:jc w:val="center"/>
+        <w:tblLayout w:type="fixed"/>
+        <w:tblLook w:firstColumn="1" w:firstRow="1" w:lastColumn="0" w:lastRow="0" w:noHBand="0" w:noVBand="1" w:val="04A0"/>
+      </w:tblPr>
+      <w:tblGrid>
+        <w:gridCol w:w="3024"/>
+        <w:gridCol w:w="7272"/>
+      </w:tblGrid>
+      <w:tr>
+        <w:tc>
+          <w:tcPr>
+            <w:tcW w:type="dxa" w:w="5162"/>
+            <w:tcBorders>
+              <w:top w:val="none"/>
+              <w:left w:val="none"/>
+              <w:bottom w:val="none"/>
+              <w:right w:val="none"/>
+            </w:tcBorders>
+            <w:tcMar>
+              <w:top w:w="40" w:type="dxa"/>
+              <w:bottom w:w="40" w:type="dxa"/>
+              <w:left w:w="40" w:type="dxa"/>
+              <w:right w:w="40" w:type="dxa"/>
+            </w:tcMar>
+          </w:tcPr>
+          <w:p>
+            <w:pPr>
+              <w:spacing w:before="160" w:after="0"/>
+              <w:jc w:val="center"/>
+            </w:pPr>
+            <w:r>
+              <w:drawing>
+                <wp:inline xmlns:a="http://schemas.openxmlformats.org/drawingml/2006/main" xmlns:pic="http://schemas.openxmlformats.org/drawingml/2006/picture">
+                  <wp:extent cx="1627632" cy="1627632"/>
+                  <wp:docPr id="1" name="Picture 1"/>
+                  <wp:cNvGraphicFramePr>
+                    <a:graphicFrameLocks noChangeAspect="1"/>
+                  </wp:cNvGraphicFramePr>
+                  <a:graphic>
+                    <a:graphicData uri="http://schemas.openxmlformats.org/drawingml/2006/picture">
+                      <pic:pic>
+                        <pic:nvPicPr>
+                          <pic:cNvPr id="0" name="profile_photo_178.png"/>
+                          <pic:cNvPicPr/>
+                        </pic:nvPicPr>
+                        <pic:blipFill>
+                          <a:blip r:embed="rId10"/>
+                          <a:stretch>
+                            <a:fillRect/>
+                          </a:stretch>
+                        </pic:blipFill>
+                        <pic:spPr>
+                          <a:xfrm>
+                            <a:off x="0" y="0"/>
+                            <a:ext cx="1627632" cy="1627632"/>
+                          </a:xfrm>
+                          <a:prstGeom prst="rect"/>
+                        </pic:spPr>
+                      </pic:pic>
+                    </a:graphicData>
+                  </a:graphic>
+                </wp:inline>
+              </w:drawing>
+            </w:r>
+          </w:p>
+        </w:tc>
+        <w:tc>
+          <w:tcPr>
+            <w:tcW w:type="dxa" w:w="5162"/>
+            <w:tcBorders>
+              <w:top w:val="none"/>
+              <w:left w:val="none"/>
+              <w:bottom w:val="none"/>
+              <w:right w:val="none"/>
+            </w:tcBorders>
+            <w:shd w:fill="23272D"/>
+            <w:tcMar>
+              <w:top w:w="160" w:type="dxa"/>
+              <w:bottom w:w="160" w:type="dxa"/>
+              <w:left w:w="240" w:type="dxa"/>
+              <w:right w:w="200" w:type="dxa"/>
+            </w:tcMar>
+          </w:tcPr>
+          <w:p>
+            <w:pPr>
+              <w:spacing w:before="160" w:after="40" w:lineRule="auto" w:line="276"/>
+            </w:pPr>
+            <w:r>
+              <w:rPr>
+                <w:rFonts w:ascii="Times New Roman" w:hAnsi="Times New Roman"/>
+                <w:b/>
+                <w:color w:val="FFFFFF"/>
+                <w:sz w:val="72"/>
+              </w:rPr>
+              <w:t>Tajrian Islam Sharan</w:t>
+              <w:br/>
+            </w:r>
+            <w:r>
+              <w:rPr>
+                <w:rFonts w:ascii="Times New Roman" w:hAnsi="Times New Roman"/>
+                <w:color w:val="DCE1E6"/>
+                <w:sz w:val="28"/>
+              </w:rPr>
+              <w:t>Web Designer &amp; Developer</w:t>
+            </w:r>
+          </w:p>
+        </w:tc>
+      </w:tr>
+    </w:tbl>
     <w:p>
       <w:pPr>
-        <w:spacing w:before="0" w:after="40"/>
-        <w:jc w:val="left"/>
+        <w:spacing w:before="80" w:after="80" w:line="240" w:lineRule="auto"/>
       </w:pPr>
-      <w:r>
-        <w:rPr>
-          <w:rFonts w:ascii="Times New Roman" w:hAnsi="Times New Roman"/>
-          <w:b/>
-          <w:color w:val="0F172A"/>
-          <w:sz w:val="64"/>
-        </w:rPr>
-        <w:t>TAJRIAN ISLAM SHARAN</w:t>
-      </w:r>
-    </w:p>
-    <w:p>
-      <w:pPr>
-        <w:spacing w:after="120"/>
-      </w:pPr>
-      <w:r>
-        <w:rPr>
-          <w:rFonts w:ascii="Times New Roman" w:hAnsi="Times New Roman"/>
-          <w:b/>
-          <w:color w:val="2563EB"/>
-          <w:sz w:val="28"/>
-        </w:rPr>
-        <w:t>Frontend Web Designer &amp; Developer</w:t>
-      </w:r>
-    </w:p>
-    <w:p>
-      <w:pPr>
-        <w:spacing w:after="280" w:line="276" w:lineRule="auto"/>
-      </w:pPr>
-      <w:r>
-        <w:rPr>
-          <w:rFonts w:ascii="Times New Roman" w:hAnsi="Times New Roman"/>
-          <w:color w:val="475569"/>
-          <w:sz w:val="21"/>
-        </w:rPr>
-        <w:t>Mobile: +880 1700-000000 | Email: tajrianislam1529@gmail.com | Address: Dhaka, Bangladesh</w:t>
-        <w:br/>
-        <w:t>GitHub: github.com/TajrianSharan | Portfolio: tajriansharan.github.io</w:t>
-      </w:r>
-    </w:p>
-    <w:p>
-      <w:pPr>
-        <w:spacing w:before="200" w:after="80"/>
-        <w:pBdr>
-          <w:bottom w:val="single" w:sz="12" w:space="2" w:color="2563EB"/>
-        </w:pBdr>
-      </w:pPr>
-      <w:r>
-        <w:rPr>
-          <w:rFonts w:ascii="Times New Roman" w:hAnsi="Times New Roman"/>
-          <w:b/>
-          <w:color w:val="1E3A8A"/>
-          <w:sz w:val="26"/>
-        </w:rPr>
-        <w:t>CAREER OBJECTIVE</w:t>
-      </w:r>
-    </w:p>
-    <w:p>
-      <w:pPr>
-        <w:spacing w:after="160" w:line="276" w:lineRule="auto"/>
-      </w:pPr>
-      <w:r>
-        <w:rPr>
-          <w:rFonts w:ascii="Times New Roman" w:hAnsi="Times New Roman"/>
-          <w:sz w:val="22"/>
-        </w:rPr>
-        <w:t>Certified Web Designer (NTVQF Level-3) with solid expertise in modern HTML5, CSS3, JavaScript, and Bootstrap framework. Passionate about designing visually appealing, user-centric, and fully responsive websites that comply with web standards and accessibility guidelines.</w:t>
-      </w:r>
-    </w:p>
-    <w:p>
-      <w:pPr>
-        <w:spacing w:before="200" w:after="80"/>
-        <w:pBdr>
-          <w:bottom w:val="single" w:sz="12" w:space="2" w:color="2563EB"/>
-        </w:pBdr>
-      </w:pPr>
-      <w:r>
-        <w:rPr>
-          <w:rFonts w:ascii="Times New Roman" w:hAnsi="Times New Roman"/>
-          <w:b/>
-          <w:color w:val="1E3A8A"/>
-          <w:sz w:val="26"/>
-        </w:rPr>
-        <w:t>TECHNICAL SKILLS</w:t>
-      </w:r>
-    </w:p>
-    <w:p>
-      <w:pPr>
-        <w:spacing w:after="40" w:line="276" w:lineRule="auto"/>
-      </w:pPr>
-      <w:r>
-        <w:rPr>
-          <w:rFonts w:ascii="Times New Roman" w:hAnsi="Times New Roman"/>
-          <w:b/>
-          <w:sz w:val="22"/>
-        </w:rPr>
-        <w:t xml:space="preserve">•  Web Technologies: </w:t>
-      </w:r>
-      <w:r>
-        <w:rPr>
-          <w:rFonts w:ascii="Times New Roman" w:hAnsi="Times New Roman"/>
-          <w:sz w:val="22"/>
-        </w:rPr>
-        <w:t>HTML5, CSS3, JavaScript (ES6+), jQuery, Responsive Web Design</w:t>
-      </w:r>
-    </w:p>
-    <w:p>
-      <w:pPr>
-        <w:spacing w:after="40" w:line="276" w:lineRule="auto"/>
-      </w:pPr>
-      <w:r>
-        <w:rPr>
-          <w:rFonts w:ascii="Times New Roman" w:hAnsi="Times New Roman"/>
-          <w:b/>
-          <w:sz w:val="22"/>
-        </w:rPr>
-        <w:t xml:space="preserve">•  Frameworks &amp; Tools: </w:t>
-      </w:r>
-      <w:r>
-        <w:rPr>
-          <w:rFonts w:ascii="Times New Roman" w:hAnsi="Times New Roman"/>
-          <w:sz w:val="22"/>
-        </w:rPr>
-        <w:t>Bootstrap 5, Tailwind CSS, VS Code, Git, GitHub</w:t>
-      </w:r>
-    </w:p>
-    <w:p>
-      <w:pPr>
-        <w:spacing w:after="40" w:line="276" w:lineRule="auto"/>
-      </w:pPr>
-      <w:r>
-        <w:rPr>
-          <w:rFonts w:ascii="Times New Roman" w:hAnsi="Times New Roman"/>
-          <w:b/>
-          <w:sz w:val="22"/>
-        </w:rPr>
-        <w:t xml:space="preserve">•  Design Tools: </w:t>
-      </w:r>
-      <w:r>
-        <w:rPr>
-          <w:rFonts w:ascii="Times New Roman" w:hAnsi="Times New Roman"/>
-          <w:sz w:val="22"/>
-        </w:rPr>
-        <w:t>Figma, Adobe Photoshop (basic), UI/UX Layout Design</w:t>
-      </w:r>
-    </w:p>
-    <w:p>
-      <w:pPr>
-        <w:spacing w:after="40" w:line="276" w:lineRule="auto"/>
-      </w:pPr>
-      <w:r>
-        <w:rPr>
-          <w:rFonts w:ascii="Times New Roman" w:hAnsi="Times New Roman"/>
-          <w:b/>
-          <w:sz w:val="22"/>
-        </w:rPr>
-        <w:t xml:space="preserve">•  Office Applications: </w:t>
-      </w:r>
-      <w:r>
-        <w:rPr>
-          <w:rFonts w:ascii="Times New Roman" w:hAnsi="Times New Roman"/>
-          <w:sz w:val="22"/>
-        </w:rPr>
-        <w:t>Microsoft Word, Microsoft Excel, PowerPoint, Bijoy &amp; Avro Typing</w:t>
-      </w:r>
-    </w:p>
-    <w:p>
-      <w:pPr>
-        <w:spacing w:before="200" w:after="80"/>
-        <w:pBdr>
-          <w:bottom w:val="single" w:sz="12" w:space="2" w:color="2563EB"/>
-        </w:pBdr>
-      </w:pPr>
-      <w:r>
-        <w:rPr>
-          <w:rFonts w:ascii="Times New Roman" w:hAnsi="Times New Roman"/>
-          <w:b/>
-          <w:color w:val="1E3A8A"/>
-          <w:sz w:val="26"/>
-        </w:rPr>
-        <w:t>WORK EXPERIENCE &amp; PRACTICAL PROJECTS</w:t>
-      </w:r>
-    </w:p>
-    <w:p>
-      <w:pPr>
-        <w:spacing w:before="80" w:after="20"/>
-      </w:pPr>
-      <w:r>
-        <w:rPr>
-          <w:rFonts w:ascii="Times New Roman" w:hAnsi="Times New Roman"/>
-          <w:b/>
-          <w:sz w:val="23"/>
-        </w:rPr>
-        <w:t>Web Designer (Trainee / Intern)</w:t>
-      </w:r>
-      <w:r>
-        <w:rPr>
-          <w:rFonts w:ascii="Times New Roman" w:hAnsi="Times New Roman"/>
-          <w:i/>
-          <w:sz w:val="21"/>
-        </w:rPr>
-        <w:t xml:space="preserve"> — ASSET Project / BTEB Training Center (2026)</w:t>
-      </w:r>
-    </w:p>
-    <w:p>
-      <w:pPr>
-        <w:spacing w:after="40" w:line="276" w:lineRule="auto"/>
-        <w:ind w:left="360"/>
-      </w:pPr>
-      <w:r>
-        <w:rPr>
-          <w:rFonts w:ascii="Times New Roman" w:hAnsi="Times New Roman"/>
-          <w:sz w:val="21"/>
-        </w:rPr>
-        <w:t>–  Designed and implemented 6-page Software Company website and Restaurant e-commerce web applications.</w:t>
-      </w:r>
-    </w:p>
-    <w:p>
-      <w:pPr>
-        <w:spacing w:after="40" w:line="276" w:lineRule="auto"/>
-        <w:ind w:left="360"/>
-      </w:pPr>
-      <w:r>
-        <w:rPr>
-          <w:rFonts w:ascii="Times New Roman" w:hAnsi="Times New Roman"/>
-          <w:sz w:val="21"/>
-        </w:rPr>
-        <w:t>–  Created mobile-first responsive layouts using Bootstrap 12-column grid system and CSS Flexbox.</w:t>
-      </w:r>
-    </w:p>
-    <w:p>
-      <w:pPr>
-        <w:spacing w:after="40" w:line="276" w:lineRule="auto"/>
-        <w:ind w:left="360"/>
-      </w:pPr>
-      <w:r>
-        <w:rPr>
-          <w:rFonts w:ascii="Times New Roman" w:hAnsi="Times New Roman"/>
-          <w:sz w:val="21"/>
-        </w:rPr>
-        <w:t>–  Implemented interactive JavaScript form validations, dynamic navigation menus, and image zoom sliders.</w:t>
-      </w:r>
-    </w:p>
-    <w:p>
-      <w:pPr>
-        <w:spacing w:before="200" w:after="80"/>
-        <w:pBdr>
-          <w:bottom w:val="single" w:sz="12" w:space="2" w:color="2563EB"/>
-        </w:pBdr>
-      </w:pPr>
-      <w:r>
-        <w:rPr>
-          <w:rFonts w:ascii="Times New Roman" w:hAnsi="Times New Roman"/>
-          <w:b/>
-          <w:color w:val="1E3A8A"/>
-          <w:sz w:val="26"/>
-        </w:rPr>
-        <w:t>EDUCATIONAL QUALIFICATIONS</w:t>
-      </w:r>
     </w:p>
     <w:tbl>
       <w:tblPr>
@@ -274,391 +127,909 @@
         <w:tblLook w:firstColumn="1" w:firstRow="1" w:lastColumn="0" w:lastRow="0" w:noHBand="0" w:noVBand="1" w:val="04A0"/>
       </w:tblPr>
       <w:tblGrid>
-        <w:gridCol w:w="1921"/>
-        <w:gridCol w:w="1921"/>
-        <w:gridCol w:w="1921"/>
-        <w:gridCol w:w="1921"/>
-        <w:gridCol w:w="1921"/>
+        <w:gridCol w:w="3528"/>
+        <w:gridCol w:w="6768"/>
       </w:tblGrid>
       <w:tr>
         <w:tc>
           <w:tcPr>
-            <w:tcW w:type="dxa" w:w="1921"/>
-            <w:shd w:fill="F1F5F9"/>
+            <w:tcW w:type="dxa" w:w="5162"/>
+            <w:tcBorders>
+              <w:top w:val="none"/>
+              <w:left w:val="none"/>
+              <w:bottom w:val="none"/>
+              <w:right w:val="none"/>
+            </w:tcBorders>
             <w:tcMar>
-              <w:top w:w="120" w:type="dxa"/>
-              <w:bottom w:w="120" w:type="dxa"/>
-              <w:left w:w="100" w:type="dxa"/>
-              <w:right w:w="100" w:type="dxa"/>
+              <w:top w:w="20" w:type="dxa"/>
+              <w:bottom w:w="20" w:type="dxa"/>
+              <w:left w:w="20" w:type="dxa"/>
+              <w:right w:w="80" w:type="dxa"/>
             </w:tcMar>
           </w:tcPr>
+          <w:p/>
           <w:p>
             <w:pPr>
-              <w:jc w:val="center"/>
+              <w:spacing w:before="160" w:after="80" w:lineRule="auto" w:line="276"/>
+            </w:pPr>
+          </w:p>
+          <w:tbl>
+            <w:tblPr>
+              <w:tblW w:type="auto" w:w="0"/>
+              <w:jc w:val="left"/>
+              <w:tblLook w:firstColumn="1" w:firstRow="1" w:lastColumn="0" w:lastRow="0" w:noHBand="0" w:noVBand="1" w:val="04A0"/>
+            </w:tblPr>
+            <w:tblGrid>
+              <w:gridCol w:w="5162"/>
+            </w:tblGrid>
+            <w:tr>
+              <w:tc>
+                <w:tcPr>
+                  <w:tcW w:type="dxa" w:w="5162"/>
+                  <w:shd w:fill="23272D"/>
+                  <w:tcBorders>
+                    <w:top w:val="none"/>
+                    <w:left w:val="none"/>
+                    <w:bottom w:val="none"/>
+                    <w:right w:val="none"/>
+                  </w:tcBorders>
+                  <w:tcMar>
+                    <w:top w:w="60" w:type="dxa"/>
+                    <w:bottom w:w="60" w:type="dxa"/>
+                    <w:left w:w="140" w:type="dxa"/>
+                    <w:right w:w="140" w:type="dxa"/>
+                  </w:tcMar>
+                </w:tcPr>
+                <w:p>
+                  <w:pPr>
+                    <w:spacing w:before="40" w:after="40"/>
+                    <w:jc w:val="center"/>
+                  </w:pPr>
+                  <w:r>
+                    <w:rPr>
+                      <w:rFonts w:ascii="Times New Roman" w:hAnsi="Times New Roman"/>
+                      <w:b/>
+                      <w:color w:val="FFFFFF"/>
+                      <w:sz w:val="26"/>
+                    </w:rPr>
+                    <w:t>CONTACT ME</w:t>
+                  </w:r>
+                </w:p>
+              </w:tc>
+            </w:tr>
+          </w:tbl>
+          <w:p/>
+          <w:p>
+            <w:pPr>
+              <w:spacing w:before="40" w:after="40" w:lineRule="auto" w:line="276"/>
+            </w:pPr>
+          </w:p>
+          <w:p>
+            <w:pPr>
+              <w:spacing w:before="40" w:after="40" w:lineRule="auto" w:line="384"/>
+            </w:pPr>
+            <w:r>
+              <w:rPr>
+                <w:rFonts w:ascii="Times New Roman" w:hAnsi="Times New Roman"/>
+                <w:color w:val="1E1E1E"/>
+                <w:sz w:val="24"/>
+              </w:rPr>
+              <w:t>Phone: +880 1700-000000</w:t>
+              <w:br/>
+            </w:r>
+            <w:r>
+              <w:rPr>
+                <w:rFonts w:ascii="Times New Roman" w:hAnsi="Times New Roman"/>
+                <w:color w:val="1E1E1E"/>
+                <w:sz w:val="24"/>
+              </w:rPr>
+              <w:t>E-mail: tajrianislam1529@gmail.com</w:t>
+              <w:br/>
+            </w:r>
+            <w:r>
+              <w:rPr>
+                <w:rFonts w:ascii="Times New Roman" w:hAnsi="Times New Roman"/>
+                <w:color w:val="1E1E1E"/>
+                <w:sz w:val="24"/>
+              </w:rPr>
+              <w:t>Address: Dhaka, Bangladesh</w:t>
+            </w:r>
+          </w:p>
+          <w:p>
+            <w:pPr>
+              <w:spacing w:before="160" w:after="80" w:lineRule="auto" w:line="276"/>
+            </w:pPr>
+          </w:p>
+          <w:tbl>
+            <w:tblPr>
+              <w:tblW w:type="auto" w:w="0"/>
+              <w:jc w:val="left"/>
+              <w:tblLook w:firstColumn="1" w:firstRow="1" w:lastColumn="0" w:lastRow="0" w:noHBand="0" w:noVBand="1" w:val="04A0"/>
+            </w:tblPr>
+            <w:tblGrid>
+              <w:gridCol w:w="5162"/>
+            </w:tblGrid>
+            <w:tr>
+              <w:tc>
+                <w:tcPr>
+                  <w:tcW w:type="dxa" w:w="5162"/>
+                  <w:shd w:fill="23272D"/>
+                  <w:tcBorders>
+                    <w:top w:val="none"/>
+                    <w:left w:val="none"/>
+                    <w:bottom w:val="none"/>
+                    <w:right w:val="none"/>
+                  </w:tcBorders>
+                  <w:tcMar>
+                    <w:top w:w="60" w:type="dxa"/>
+                    <w:bottom w:w="60" w:type="dxa"/>
+                    <w:left w:w="140" w:type="dxa"/>
+                    <w:right w:w="140" w:type="dxa"/>
+                  </w:tcMar>
+                </w:tcPr>
+                <w:p>
+                  <w:pPr>
+                    <w:spacing w:before="40" w:after="40"/>
+                    <w:jc w:val="center"/>
+                  </w:pPr>
+                  <w:r>
+                    <w:rPr>
+                      <w:rFonts w:ascii="Times New Roman" w:hAnsi="Times New Roman"/>
+                      <w:b/>
+                      <w:color w:val="FFFFFF"/>
+                      <w:sz w:val="26"/>
+                    </w:rPr>
+                    <w:t>EDUCATION</w:t>
+                  </w:r>
+                </w:p>
+              </w:tc>
+            </w:tr>
+          </w:tbl>
+          <w:p/>
+          <w:p>
+            <w:pPr>
+              <w:spacing w:before="40" w:after="40" w:lineRule="auto" w:line="276"/>
+            </w:pPr>
+          </w:p>
+          <w:p>
+            <w:pPr>
+              <w:spacing w:before="40" w:after="40" w:lineRule="auto" w:line="384"/>
             </w:pPr>
             <w:r>
               <w:rPr>
                 <w:rFonts w:ascii="Times New Roman" w:hAnsi="Times New Roman"/>
                 <w:b/>
-                <w:sz w:val="21"/>
+                <w:sz w:val="24"/>
               </w:rPr>
-              <w:t>Exam / Degree</w:t>
+              <w:t>Secondary School Certificate (SSC)</w:t>
+              <w:br/>
+            </w:r>
+            <w:r>
+              <w:rPr>
+                <w:rFonts w:ascii="Times New Roman" w:hAnsi="Times New Roman"/>
+                <w:sz w:val="24"/>
+              </w:rPr>
+              <w:t>Dhaka Board</w:t>
+              <w:br/>
+            </w:r>
+            <w:r>
+              <w:rPr>
+                <w:rFonts w:ascii="Times New Roman" w:hAnsi="Times New Roman"/>
+                <w:sz w:val="24"/>
+              </w:rPr>
+              <w:t>2016-2018</w:t>
+              <w:br/>
+              <w:br/>
+            </w:r>
+            <w:r>
+              <w:rPr>
+                <w:rFonts w:ascii="Times New Roman" w:hAnsi="Times New Roman"/>
+                <w:b/>
+                <w:sz w:val="24"/>
+              </w:rPr>
+              <w:t>Higher Secondary Certificate (HSC)</w:t>
+              <w:br/>
+            </w:r>
+            <w:r>
+              <w:rPr>
+                <w:rFonts w:ascii="Times New Roman" w:hAnsi="Times New Roman"/>
+                <w:sz w:val="24"/>
+              </w:rPr>
+              <w:t>Dhaka Board</w:t>
+              <w:br/>
+            </w:r>
+            <w:r>
+              <w:rPr>
+                <w:rFonts w:ascii="Times New Roman" w:hAnsi="Times New Roman"/>
+                <w:sz w:val="24"/>
+              </w:rPr>
+              <w:t>2018-2020</w:t>
+              <w:br/>
+              <w:br/>
+            </w:r>
+            <w:r>
+              <w:rPr>
+                <w:rFonts w:ascii="Times New Roman" w:hAnsi="Times New Roman"/>
+                <w:b/>
+                <w:sz w:val="24"/>
+              </w:rPr>
+              <w:t>NTVQF Level-3 in Web Design</w:t>
+              <w:br/>
+            </w:r>
+            <w:r>
+              <w:rPr>
+                <w:rFonts w:ascii="Times New Roman" w:hAnsi="Times New Roman"/>
+                <w:sz w:val="24"/>
+              </w:rPr>
+              <w:t>BTEB Certified</w:t>
+              <w:br/>
+            </w:r>
+            <w:r>
+              <w:rPr>
+                <w:rFonts w:ascii="Times New Roman" w:hAnsi="Times New Roman"/>
+                <w:sz w:val="24"/>
+              </w:rPr>
+              <w:t>2023-2024</w:t>
             </w:r>
           </w:p>
+          <w:p>
+            <w:pPr>
+              <w:spacing w:before="160" w:after="80" w:lineRule="auto" w:line="276"/>
+            </w:pPr>
+          </w:p>
+          <w:tbl>
+            <w:tblPr>
+              <w:tblW w:type="auto" w:w="0"/>
+              <w:jc w:val="left"/>
+              <w:tblLook w:firstColumn="1" w:firstRow="1" w:lastColumn="0" w:lastRow="0" w:noHBand="0" w:noVBand="1" w:val="04A0"/>
+            </w:tblPr>
+            <w:tblGrid>
+              <w:gridCol w:w="5162"/>
+            </w:tblGrid>
+            <w:tr>
+              <w:tc>
+                <w:tcPr>
+                  <w:tcW w:type="dxa" w:w="5162"/>
+                  <w:shd w:fill="23272D"/>
+                  <w:tcBorders>
+                    <w:top w:val="none"/>
+                    <w:left w:val="none"/>
+                    <w:bottom w:val="none"/>
+                    <w:right w:val="none"/>
+                  </w:tcBorders>
+                  <w:tcMar>
+                    <w:top w:w="60" w:type="dxa"/>
+                    <w:bottom w:w="60" w:type="dxa"/>
+                    <w:left w:w="140" w:type="dxa"/>
+                    <w:right w:w="140" w:type="dxa"/>
+                  </w:tcMar>
+                </w:tcPr>
+                <w:p>
+                  <w:pPr>
+                    <w:spacing w:before="40" w:after="40"/>
+                    <w:jc w:val="center"/>
+                  </w:pPr>
+                  <w:r>
+                    <w:rPr>
+                      <w:rFonts w:ascii="Times New Roman" w:hAnsi="Times New Roman"/>
+                      <w:b/>
+                      <w:color w:val="FFFFFF"/>
+                      <w:sz w:val="26"/>
+                    </w:rPr>
+                    <w:t>SKILLS</w:t>
+                  </w:r>
+                </w:p>
+              </w:tc>
+            </w:tr>
+          </w:tbl>
+          <w:p/>
+          <w:p>
+            <w:pPr>
+              <w:spacing w:before="40" w:after="40" w:lineRule="auto" w:line="276"/>
+            </w:pPr>
+          </w:p>
+          <w:tbl>
+            <w:tblPr>
+              <w:tblW w:type="auto" w:w="0"/>
+              <w:tblLayout w:type="fixed"/>
+              <w:tblLook w:firstColumn="1" w:firstRow="1" w:lastColumn="0" w:lastRow="0" w:noHBand="0" w:noVBand="1" w:val="04A0"/>
+            </w:tblPr>
+            <w:tblGrid>
+              <w:gridCol w:w="1872"/>
+              <w:gridCol w:w="1440"/>
+            </w:tblGrid>
+            <w:tr>
+              <w:tc>
+                <w:tcPr>
+                  <w:tcW w:type="dxa" w:w="2581"/>
+                  <w:tcBorders>
+                    <w:top w:val="none"/>
+                    <w:left w:val="none"/>
+                    <w:bottom w:val="none"/>
+                    <w:right w:val="none"/>
+                  </w:tcBorders>
+                  <w:tcMar>
+                    <w:top w:w="20" w:type="dxa"/>
+                    <w:bottom w:w="20" w:type="dxa"/>
+                    <w:left w:w="10" w:type="dxa"/>
+                    <w:right w:w="10" w:type="dxa"/>
+                  </w:tcMar>
+                </w:tcPr>
+                <w:p>
+                  <w:pPr>
+                    <w:spacing w:before="40" w:after="40" w:lineRule="auto" w:line="384"/>
+                  </w:pPr>
+                  <w:r>
+                    <w:rPr>
+                      <w:rFonts w:ascii="Times New Roman" w:hAnsi="Times New Roman"/>
+                      <w:b/>
+                      <w:sz w:val="23"/>
+                    </w:rPr>
+                    <w:t>•  UI/UX</w:t>
+                  </w:r>
+                </w:p>
+              </w:tc>
+              <w:tc>
+                <w:tcPr>
+                  <w:tcW w:type="dxa" w:w="2581"/>
+                  <w:tcBorders>
+                    <w:top w:val="none"/>
+                    <w:left w:val="none"/>
+                    <w:bottom w:val="none"/>
+                    <w:right w:val="none"/>
+                  </w:tcBorders>
+                  <w:tcMar>
+                    <w:top w:w="20" w:type="dxa"/>
+                    <w:bottom w:w="20" w:type="dxa"/>
+                    <w:left w:w="10" w:type="dxa"/>
+                    <w:right w:w="10" w:type="dxa"/>
+                  </w:tcMar>
+                </w:tcPr>
+                <w:p>
+                  <w:pPr>
+                    <w:spacing w:before="80" w:after="40"/>
+                    <w:jc w:val="left"/>
+                  </w:pPr>
+                  <w:r>
+                    <w:drawing>
+                      <wp:inline xmlns:a="http://schemas.openxmlformats.org/drawingml/2006/main" xmlns:pic="http://schemas.openxmlformats.org/drawingml/2006/picture">
+                        <wp:extent cx="868680" cy="109728"/>
+                        <wp:docPr id="2" name="Picture 2"/>
+                        <wp:cNvGraphicFramePr>
+                          <a:graphicFrameLocks noChangeAspect="1"/>
+                        </wp:cNvGraphicFramePr>
+                        <a:graphic>
+                          <a:graphicData uri="http://schemas.openxmlformats.org/drawingml/2006/picture">
+                            <pic:pic>
+                              <pic:nvPicPr>
+                                <pic:cNvPr id="0" name="skill_bar_uiux.png"/>
+                                <pic:cNvPicPr/>
+                              </pic:nvPicPr>
+                              <pic:blipFill>
+                                <a:blip r:embed="rId11"/>
+                                <a:stretch>
+                                  <a:fillRect/>
+                                </a:stretch>
+                              </pic:blipFill>
+                              <pic:spPr>
+                                <a:xfrm>
+                                  <a:off x="0" y="0"/>
+                                  <a:ext cx="868680" cy="109728"/>
+                                </a:xfrm>
+                                <a:prstGeom prst="rect"/>
+                              </pic:spPr>
+                            </pic:pic>
+                          </a:graphicData>
+                        </a:graphic>
+                      </wp:inline>
+                    </w:drawing>
+                  </w:r>
+                </w:p>
+              </w:tc>
+            </w:tr>
+            <w:tr>
+              <w:tc>
+                <w:tcPr>
+                  <w:tcW w:type="dxa" w:w="2581"/>
+                  <w:tcBorders>
+                    <w:top w:val="none"/>
+                    <w:left w:val="none"/>
+                    <w:bottom w:val="none"/>
+                    <w:right w:val="none"/>
+                  </w:tcBorders>
+                  <w:tcMar>
+                    <w:top w:w="20" w:type="dxa"/>
+                    <w:bottom w:w="20" w:type="dxa"/>
+                    <w:left w:w="10" w:type="dxa"/>
+                    <w:right w:w="10" w:type="dxa"/>
+                  </w:tcMar>
+                </w:tcPr>
+                <w:p>
+                  <w:pPr>
+                    <w:spacing w:before="40" w:after="40" w:lineRule="auto" w:line="384"/>
+                  </w:pPr>
+                  <w:r>
+                    <w:rPr>
+                      <w:rFonts w:ascii="Times New Roman" w:hAnsi="Times New Roman"/>
+                      <w:b/>
+                      <w:sz w:val="23"/>
+                    </w:rPr>
+                    <w:t>•  Visual Design</w:t>
+                  </w:r>
+                </w:p>
+              </w:tc>
+              <w:tc>
+                <w:tcPr>
+                  <w:tcW w:type="dxa" w:w="2581"/>
+                  <w:tcBorders>
+                    <w:top w:val="none"/>
+                    <w:left w:val="none"/>
+                    <w:bottom w:val="none"/>
+                    <w:right w:val="none"/>
+                  </w:tcBorders>
+                  <w:tcMar>
+                    <w:top w:w="20" w:type="dxa"/>
+                    <w:bottom w:w="20" w:type="dxa"/>
+                    <w:left w:w="10" w:type="dxa"/>
+                    <w:right w:w="10" w:type="dxa"/>
+                  </w:tcMar>
+                </w:tcPr>
+                <w:p>
+                  <w:pPr>
+                    <w:spacing w:before="80" w:after="40"/>
+                    <w:jc w:val="left"/>
+                  </w:pPr>
+                  <w:r>
+                    <w:drawing>
+                      <wp:inline xmlns:a="http://schemas.openxmlformats.org/drawingml/2006/main" xmlns:pic="http://schemas.openxmlformats.org/drawingml/2006/picture">
+                        <wp:extent cx="868680" cy="109728"/>
+                        <wp:docPr id="3" name="Picture 3"/>
+                        <wp:cNvGraphicFramePr>
+                          <a:graphicFrameLocks noChangeAspect="1"/>
+                        </wp:cNvGraphicFramePr>
+                        <a:graphic>
+                          <a:graphicData uri="http://schemas.openxmlformats.org/drawingml/2006/picture">
+                            <pic:pic>
+                              <pic:nvPicPr>
+                                <pic:cNvPr id="0" name="skill_bar_visual.png"/>
+                                <pic:cNvPicPr/>
+                              </pic:nvPicPr>
+                              <pic:blipFill>
+                                <a:blip r:embed="rId12"/>
+                                <a:stretch>
+                                  <a:fillRect/>
+                                </a:stretch>
+                              </pic:blipFill>
+                              <pic:spPr>
+                                <a:xfrm>
+                                  <a:off x="0" y="0"/>
+                                  <a:ext cx="868680" cy="109728"/>
+                                </a:xfrm>
+                                <a:prstGeom prst="rect"/>
+                              </pic:spPr>
+                            </pic:pic>
+                          </a:graphicData>
+                        </a:graphic>
+                      </wp:inline>
+                    </w:drawing>
+                  </w:r>
+                </w:p>
+              </w:tc>
+            </w:tr>
+            <w:tr>
+              <w:tc>
+                <w:tcPr>
+                  <w:tcW w:type="dxa" w:w="2581"/>
+                  <w:tcBorders>
+                    <w:top w:val="none"/>
+                    <w:left w:val="none"/>
+                    <w:bottom w:val="none"/>
+                    <w:right w:val="none"/>
+                  </w:tcBorders>
+                  <w:tcMar>
+                    <w:top w:w="20" w:type="dxa"/>
+                    <w:bottom w:w="20" w:type="dxa"/>
+                    <w:left w:w="10" w:type="dxa"/>
+                    <w:right w:w="10" w:type="dxa"/>
+                  </w:tcMar>
+                </w:tcPr>
+                <w:p>
+                  <w:pPr>
+                    <w:spacing w:before="40" w:after="40" w:lineRule="auto" w:line="384"/>
+                  </w:pPr>
+                  <w:r>
+                    <w:rPr>
+                      <w:rFonts w:ascii="Times New Roman" w:hAnsi="Times New Roman"/>
+                      <w:b/>
+                      <w:sz w:val="23"/>
+                    </w:rPr>
+                    <w:t>•  User Flows</w:t>
+                  </w:r>
+                </w:p>
+              </w:tc>
+              <w:tc>
+                <w:tcPr>
+                  <w:tcW w:type="dxa" w:w="2581"/>
+                  <w:tcBorders>
+                    <w:top w:val="none"/>
+                    <w:left w:val="none"/>
+                    <w:bottom w:val="none"/>
+                    <w:right w:val="none"/>
+                  </w:tcBorders>
+                  <w:tcMar>
+                    <w:top w:w="20" w:type="dxa"/>
+                    <w:bottom w:w="20" w:type="dxa"/>
+                    <w:left w:w="10" w:type="dxa"/>
+                    <w:right w:w="10" w:type="dxa"/>
+                  </w:tcMar>
+                </w:tcPr>
+                <w:p>
+                  <w:pPr>
+                    <w:spacing w:before="80" w:after="40"/>
+                    <w:jc w:val="left"/>
+                  </w:pPr>
+                  <w:r>
+                    <w:drawing>
+                      <wp:inline xmlns:a="http://schemas.openxmlformats.org/drawingml/2006/main" xmlns:pic="http://schemas.openxmlformats.org/drawingml/2006/picture">
+                        <wp:extent cx="868680" cy="109728"/>
+                        <wp:docPr id="4" name="Picture 4"/>
+                        <wp:cNvGraphicFramePr>
+                          <a:graphicFrameLocks noChangeAspect="1"/>
+                        </wp:cNvGraphicFramePr>
+                        <a:graphic>
+                          <a:graphicData uri="http://schemas.openxmlformats.org/drawingml/2006/picture">
+                            <pic:pic>
+                              <pic:nvPicPr>
+                                <pic:cNvPr id="0" name="skill_bar_userflow.png"/>
+                                <pic:cNvPicPr/>
+                              </pic:nvPicPr>
+                              <pic:blipFill>
+                                <a:blip r:embed="rId13"/>
+                                <a:stretch>
+                                  <a:fillRect/>
+                                </a:stretch>
+                              </pic:blipFill>
+                              <pic:spPr>
+                                <a:xfrm>
+                                  <a:off x="0" y="0"/>
+                                  <a:ext cx="868680" cy="109728"/>
+                                </a:xfrm>
+                                <a:prstGeom prst="rect"/>
+                              </pic:spPr>
+                            </pic:pic>
+                          </a:graphicData>
+                        </a:graphic>
+                      </wp:inline>
+                    </w:drawing>
+                  </w:r>
+                </w:p>
+              </w:tc>
+            </w:tr>
+            <w:tr>
+              <w:tc>
+                <w:tcPr>
+                  <w:tcW w:type="dxa" w:w="2581"/>
+                  <w:tcBorders>
+                    <w:top w:val="none"/>
+                    <w:left w:val="none"/>
+                    <w:bottom w:val="none"/>
+                    <w:right w:val="none"/>
+                  </w:tcBorders>
+                  <w:tcMar>
+                    <w:top w:w="20" w:type="dxa"/>
+                    <w:bottom w:w="20" w:type="dxa"/>
+                    <w:left w:w="10" w:type="dxa"/>
+                    <w:right w:w="10" w:type="dxa"/>
+                  </w:tcMar>
+                </w:tcPr>
+                <w:p>
+                  <w:pPr>
+                    <w:spacing w:before="40" w:after="40" w:lineRule="auto" w:line="384"/>
+                  </w:pPr>
+                  <w:r>
+                    <w:rPr>
+                      <w:rFonts w:ascii="Times New Roman" w:hAnsi="Times New Roman"/>
+                      <w:b/>
+                      <w:sz w:val="23"/>
+                    </w:rPr>
+                    <w:t>•  Process Flows</w:t>
+                  </w:r>
+                </w:p>
+              </w:tc>
+              <w:tc>
+                <w:tcPr>
+                  <w:tcW w:type="dxa" w:w="2581"/>
+                  <w:tcBorders>
+                    <w:top w:val="none"/>
+                    <w:left w:val="none"/>
+                    <w:bottom w:val="none"/>
+                    <w:right w:val="none"/>
+                  </w:tcBorders>
+                  <w:tcMar>
+                    <w:top w:w="20" w:type="dxa"/>
+                    <w:bottom w:w="20" w:type="dxa"/>
+                    <w:left w:w="10" w:type="dxa"/>
+                    <w:right w:w="10" w:type="dxa"/>
+                  </w:tcMar>
+                </w:tcPr>
+                <w:p>
+                  <w:pPr>
+                    <w:spacing w:before="80" w:after="40"/>
+                    <w:jc w:val="left"/>
+                  </w:pPr>
+                  <w:r>
+                    <w:drawing>
+                      <wp:inline xmlns:a="http://schemas.openxmlformats.org/drawingml/2006/main" xmlns:pic="http://schemas.openxmlformats.org/drawingml/2006/picture">
+                        <wp:extent cx="868680" cy="109728"/>
+                        <wp:docPr id="5" name="Picture 5"/>
+                        <wp:cNvGraphicFramePr>
+                          <a:graphicFrameLocks noChangeAspect="1"/>
+                        </wp:cNvGraphicFramePr>
+                        <a:graphic>
+                          <a:graphicData uri="http://schemas.openxmlformats.org/drawingml/2006/picture">
+                            <pic:pic>
+                              <pic:nvPicPr>
+                                <pic:cNvPr id="0" name="skill_bar_processflow.png"/>
+                                <pic:cNvPicPr/>
+                              </pic:nvPicPr>
+                              <pic:blipFill>
+                                <a:blip r:embed="rId14"/>
+                                <a:stretch>
+                                  <a:fillRect/>
+                                </a:stretch>
+                              </pic:blipFill>
+                              <pic:spPr>
+                                <a:xfrm>
+                                  <a:off x="0" y="0"/>
+                                  <a:ext cx="868680" cy="109728"/>
+                                </a:xfrm>
+                                <a:prstGeom prst="rect"/>
+                              </pic:spPr>
+                            </pic:pic>
+                          </a:graphicData>
+                        </a:graphic>
+                      </wp:inline>
+                    </w:drawing>
+                  </w:r>
+                </w:p>
+              </w:tc>
+            </w:tr>
+          </w:tbl>
+          <w:p/>
         </w:tc>
         <w:tc>
           <w:tcPr>
-            <w:tcW w:type="dxa" w:w="1921"/>
-            <w:shd w:fill="F1F5F9"/>
+            <w:tcW w:type="dxa" w:w="5162"/>
+            <w:tcBorders>
+              <w:top w:val="none"/>
+              <w:left w:val="none"/>
+              <w:bottom w:val="none"/>
+              <w:right w:val="none"/>
+            </w:tcBorders>
             <w:tcMar>
-              <w:top w:w="120" w:type="dxa"/>
-              <w:bottom w:w="120" w:type="dxa"/>
-              <w:left w:w="100" w:type="dxa"/>
-              <w:right w:w="100" w:type="dxa"/>
+              <w:top w:w="20" w:type="dxa"/>
+              <w:bottom w:w="20" w:type="dxa"/>
+              <w:left w:w="80" w:type="dxa"/>
+              <w:right w:w="20" w:type="dxa"/>
             </w:tcMar>
           </w:tcPr>
+          <w:p/>
           <w:p>
             <w:pPr>
-              <w:jc w:val="center"/>
+              <w:spacing w:before="160" w:after="120"/>
             </w:pPr>
             <w:r>
               <w:rPr>
                 <w:rFonts w:ascii="Times New Roman" w:hAnsi="Times New Roman"/>
                 <w:b/>
-                <w:sz w:val="21"/>
+                <w:sz w:val="28"/>
               </w:rPr>
-              <w:t>Board / Institute</w:t>
+              <w:t xml:space="preserve">Work Experience  </w:t>
+            </w:r>
+            <w:r>
+              <w:rPr>
+                <w:rFonts w:ascii="Times New Roman" w:hAnsi="Times New Roman"/>
+                <w:b/>
+                <w:color w:val="323232"/>
+                <w:sz w:val="28"/>
+              </w:rPr>
+              <w:t>________________________________________</w:t>
             </w:r>
           </w:p>
-        </w:tc>
-        <w:tc>
-          <w:tcPr>
-            <w:tcW w:type="dxa" w:w="1921"/>
-            <w:shd w:fill="F1F5F9"/>
-            <w:tcMar>
-              <w:top w:w="120" w:type="dxa"/>
-              <w:bottom w:w="120" w:type="dxa"/>
-              <w:left w:w="100" w:type="dxa"/>
-              <w:right w:w="100" w:type="dxa"/>
-            </w:tcMar>
-          </w:tcPr>
           <w:p>
             <w:pPr>
-              <w:jc w:val="center"/>
+              <w:spacing w:before="80" w:after="80" w:lineRule="auto" w:line="384"/>
             </w:pPr>
             <w:r>
               <w:rPr>
                 <w:rFonts w:ascii="Times New Roman" w:hAnsi="Times New Roman"/>
                 <w:b/>
-                <w:sz w:val="21"/>
+                <w:sz w:val="20"/>
               </w:rPr>
-              <w:t>Group / Subject</w:t>
+              <w:t xml:space="preserve">■  </w:t>
+            </w:r>
+            <w:r>
+              <w:rPr>
+                <w:rFonts w:ascii="Times New Roman" w:hAnsi="Times New Roman"/>
+                <w:b/>
+                <w:sz w:val="24"/>
+              </w:rPr>
+              <w:t>Senior Web Designer</w:t>
+              <w:br/>
+            </w:r>
+            <w:r>
+              <w:rPr>
+                <w:rFonts w:ascii="Times New Roman" w:hAnsi="Times New Roman"/>
+                <w:sz w:val="24"/>
+              </w:rPr>
+              <w:t xml:space="preserve">    Creative IT &amp; Tech</w:t>
+              <w:br/>
+            </w:r>
+            <w:r>
+              <w:rPr>
+                <w:rFonts w:ascii="Times New Roman" w:hAnsi="Times New Roman"/>
+                <w:sz w:val="24"/>
+              </w:rPr>
+              <w:t xml:space="preserve">    2022-2024</w:t>
+              <w:br/>
+              <w:br/>
+            </w:r>
+            <w:r>
+              <w:rPr>
+                <w:rFonts w:ascii="Times New Roman" w:hAnsi="Times New Roman"/>
+                <w:b/>
+                <w:sz w:val="20"/>
+              </w:rPr>
+              <w:t xml:space="preserve">■  </w:t>
+            </w:r>
+            <w:r>
+              <w:rPr>
+                <w:rFonts w:ascii="Times New Roman" w:hAnsi="Times New Roman"/>
+                <w:b/>
+                <w:sz w:val="24"/>
+              </w:rPr>
+              <w:t>Frontend Designer</w:t>
+              <w:br/>
+            </w:r>
+            <w:r>
+              <w:rPr>
+                <w:rFonts w:ascii="Times New Roman" w:hAnsi="Times New Roman"/>
+                <w:sz w:val="24"/>
+              </w:rPr>
+              <w:t xml:space="preserve">    Apex Soft Solutions</w:t>
+              <w:br/>
+            </w:r>
+            <w:r>
+              <w:rPr>
+                <w:rFonts w:ascii="Times New Roman" w:hAnsi="Times New Roman"/>
+                <w:sz w:val="24"/>
+              </w:rPr>
+              <w:t xml:space="preserve">    2020-2022</w:t>
+              <w:br/>
+              <w:br/>
+            </w:r>
+            <w:r>
+              <w:rPr>
+                <w:rFonts w:ascii="Times New Roman" w:hAnsi="Times New Roman"/>
+                <w:b/>
+                <w:sz w:val="20"/>
+              </w:rPr>
+              <w:t xml:space="preserve">■  </w:t>
+            </w:r>
+            <w:r>
+              <w:rPr>
+                <w:rFonts w:ascii="Times New Roman" w:hAnsi="Times New Roman"/>
+                <w:b/>
+                <w:sz w:val="24"/>
+              </w:rPr>
+              <w:t>Junior UI Designer</w:t>
+              <w:br/>
+            </w:r>
+            <w:r>
+              <w:rPr>
+                <w:rFonts w:ascii="Times New Roman" w:hAnsi="Times New Roman"/>
+                <w:sz w:val="24"/>
+              </w:rPr>
+              <w:t xml:space="preserve">    WebCraft Agency</w:t>
+              <w:br/>
+            </w:r>
+            <w:r>
+              <w:rPr>
+                <w:rFonts w:ascii="Times New Roman" w:hAnsi="Times New Roman"/>
+                <w:sz w:val="24"/>
+              </w:rPr>
+              <w:t xml:space="preserve">    2018-2020</w:t>
             </w:r>
           </w:p>
-        </w:tc>
-        <w:tc>
-          <w:tcPr>
-            <w:tcW w:type="dxa" w:w="1921"/>
-            <w:shd w:fill="F1F5F9"/>
-            <w:tcMar>
-              <w:top w:w="120" w:type="dxa"/>
-              <w:bottom w:w="120" w:type="dxa"/>
-              <w:left w:w="100" w:type="dxa"/>
-              <w:right w:w="100" w:type="dxa"/>
-            </w:tcMar>
-          </w:tcPr>
+          <w:tbl>
+            <w:tblPr>
+              <w:tblW w:type="auto" w:w="0"/>
+              <w:jc w:val="center"/>
+              <w:tblLayout w:type="fixed"/>
+              <w:tblLook w:firstColumn="1" w:firstRow="1" w:lastColumn="0" w:lastRow="0" w:noHBand="0" w:noVBand="1" w:val="04A0"/>
+            </w:tblPr>
+            <w:tblGrid>
+              <w:gridCol w:w="6696"/>
+            </w:tblGrid>
+            <w:tr>
+              <w:tc>
+                <w:tcPr>
+                  <w:tcW w:type="dxa" w:w="5162"/>
+                  <w:shd w:fill="23272D"/>
+                  <w:tcBorders>
+                    <w:top w:val="none"/>
+                    <w:left w:val="none"/>
+                    <w:bottom w:val="none"/>
+                    <w:right w:val="none"/>
+                  </w:tcBorders>
+                  <w:tcMar>
+                    <w:top w:w="60" w:type="dxa"/>
+                    <w:bottom w:w="60" w:type="dxa"/>
+                    <w:left w:w="140" w:type="dxa"/>
+                    <w:right w:w="140" w:type="dxa"/>
+                  </w:tcMar>
+                </w:tcPr>
+                <w:p>
+                  <w:pPr>
+                    <w:spacing w:before="40" w:after="40"/>
+                  </w:pPr>
+                  <w:r>
+                    <w:rPr>
+                      <w:rFonts w:ascii="Times New Roman" w:hAnsi="Times New Roman"/>
+                      <w:b/>
+                      <w:color w:val="FFFFFF"/>
+                      <w:sz w:val="28"/>
+                    </w:rPr>
+                    <w:t>Reference:</w:t>
+                  </w:r>
+                </w:p>
+              </w:tc>
+            </w:tr>
+          </w:tbl>
+          <w:p/>
           <w:p>
             <w:pPr>
-              <w:jc w:val="center"/>
+              <w:spacing w:before="120" w:after="40" w:lineRule="auto" w:line="384"/>
             </w:pPr>
             <w:r>
               <w:rPr>
                 <w:rFonts w:ascii="Times New Roman" w:hAnsi="Times New Roman"/>
-                <w:b/>
-                <w:sz w:val="21"/>
+                <w:sz w:val="24"/>
               </w:rPr>
-              <w:t>Year</w:t>
+              <w:t>Name: Mr. Mouree</w:t>
+              <w:br/>
             </w:r>
-          </w:p>
-        </w:tc>
-        <w:tc>
-          <w:tcPr>
-            <w:tcW w:type="dxa" w:w="1921"/>
-            <w:shd w:fill="F1F5F9"/>
-            <w:tcMar>
-              <w:top w:w="120" w:type="dxa"/>
-              <w:bottom w:w="120" w:type="dxa"/>
-              <w:left w:w="100" w:type="dxa"/>
-              <w:right w:w="100" w:type="dxa"/>
-            </w:tcMar>
-          </w:tcPr>
-          <w:p>
-            <w:pPr>
-              <w:jc w:val="center"/>
-            </w:pPr>
             <w:r>
               <w:rPr>
                 <w:rFonts w:ascii="Times New Roman" w:hAnsi="Times New Roman"/>
-                <w:b/>
-                <w:sz w:val="21"/>
+                <w:sz w:val="24"/>
               </w:rPr>
-              <w:t>Result</w:t>
+              <w:t>Designation: Managing Director</w:t>
+              <w:br/>
             </w:r>
-          </w:p>
-        </w:tc>
-      </w:tr>
-      <w:tr>
-        <w:tc>
-          <w:tcPr>
-            <w:tcW w:type="dxa" w:w="1921"/>
-            <w:tcMar>
-              <w:top w:w="100" w:type="dxa"/>
-              <w:bottom w:w="100" w:type="dxa"/>
-              <w:left w:w="100" w:type="dxa"/>
-              <w:right w:w="100" w:type="dxa"/>
-            </w:tcMar>
-          </w:tcPr>
-          <w:p>
             <w:r>
               <w:rPr>
                 <w:rFonts w:ascii="Times New Roman" w:hAnsi="Times New Roman"/>
-                <w:sz w:val="20"/>
+                <w:sz w:val="24"/>
               </w:rPr>
-              <w:t>NTVQF Level-3</w:t>
+              <w:t>Mobile: 01xxxxxxxxx</w:t>
+              <w:br/>
             </w:r>
-          </w:p>
-        </w:tc>
-        <w:tc>
-          <w:tcPr>
-            <w:tcW w:type="dxa" w:w="1921"/>
-            <w:tcMar>
-              <w:top w:w="100" w:type="dxa"/>
-              <w:bottom w:w="100" w:type="dxa"/>
-              <w:left w:w="100" w:type="dxa"/>
-              <w:right w:w="100" w:type="dxa"/>
-            </w:tcMar>
-          </w:tcPr>
-          <w:p>
             <w:r>
               <w:rPr>
                 <w:rFonts w:ascii="Times New Roman" w:hAnsi="Times New Roman"/>
-                <w:sz w:val="20"/>
+                <w:sz w:val="24"/>
               </w:rPr>
-              <w:t>BTEB</w:t>
-            </w:r>
-          </w:p>
-        </w:tc>
-        <w:tc>
-          <w:tcPr>
-            <w:tcW w:type="dxa" w:w="1921"/>
-            <w:tcMar>
-              <w:top w:w="100" w:type="dxa"/>
-              <w:bottom w:w="100" w:type="dxa"/>
-              <w:left w:w="100" w:type="dxa"/>
-              <w:right w:w="100" w:type="dxa"/>
-            </w:tcMar>
-          </w:tcPr>
-          <w:p>
-            <w:r>
-              <w:rPr>
-                <w:rFonts w:ascii="Times New Roman" w:hAnsi="Times New Roman"/>
-                <w:sz w:val="20"/>
-              </w:rPr>
-              <w:t>Web Design</w:t>
-            </w:r>
-          </w:p>
-        </w:tc>
-        <w:tc>
-          <w:tcPr>
-            <w:tcW w:type="dxa" w:w="1921"/>
-            <w:tcMar>
-              <w:top w:w="100" w:type="dxa"/>
-              <w:bottom w:w="100" w:type="dxa"/>
-              <w:left w:w="100" w:type="dxa"/>
-              <w:right w:w="100" w:type="dxa"/>
-            </w:tcMar>
-          </w:tcPr>
-          <w:p>
-            <w:pPr>
-              <w:jc w:val="center"/>
-            </w:pPr>
-            <w:r>
-              <w:rPr>
-                <w:rFonts w:ascii="Times New Roman" w:hAnsi="Times New Roman"/>
-                <w:sz w:val="20"/>
-              </w:rPr>
-              <w:t>2026</w:t>
-            </w:r>
-          </w:p>
-        </w:tc>
-        <w:tc>
-          <w:tcPr>
-            <w:tcW w:type="dxa" w:w="1921"/>
-            <w:tcMar>
-              <w:top w:w="100" w:type="dxa"/>
-              <w:bottom w:w="100" w:type="dxa"/>
-              <w:left w:w="100" w:type="dxa"/>
-              <w:right w:w="100" w:type="dxa"/>
-            </w:tcMar>
-          </w:tcPr>
-          <w:p>
-            <w:pPr>
-              <w:jc w:val="center"/>
-            </w:pPr>
-            <w:r>
-              <w:rPr>
-                <w:rFonts w:ascii="Times New Roman" w:hAnsi="Times New Roman"/>
-                <w:sz w:val="20"/>
-              </w:rPr>
-              <w:t>Appeared</w:t>
-            </w:r>
-          </w:p>
-        </w:tc>
-      </w:tr>
-      <w:tr>
-        <w:tc>
-          <w:tcPr>
-            <w:tcW w:type="dxa" w:w="1921"/>
-            <w:tcMar>
-              <w:top w:w="100" w:type="dxa"/>
-              <w:bottom w:w="100" w:type="dxa"/>
-              <w:left w:w="100" w:type="dxa"/>
-              <w:right w:w="100" w:type="dxa"/>
-            </w:tcMar>
-          </w:tcPr>
-          <w:p>
-            <w:r>
-              <w:rPr>
-                <w:rFonts w:ascii="Times New Roman" w:hAnsi="Times New Roman"/>
-                <w:sz w:val="20"/>
-              </w:rPr>
-              <w:t>H.S.C</w:t>
-            </w:r>
-          </w:p>
-        </w:tc>
-        <w:tc>
-          <w:tcPr>
-            <w:tcW w:type="dxa" w:w="1921"/>
-            <w:tcMar>
-              <w:top w:w="100" w:type="dxa"/>
-              <w:bottom w:w="100" w:type="dxa"/>
-              <w:left w:w="100" w:type="dxa"/>
-              <w:right w:w="100" w:type="dxa"/>
-            </w:tcMar>
-          </w:tcPr>
-          <w:p>
-            <w:r>
-              <w:rPr>
-                <w:rFonts w:ascii="Times New Roman" w:hAnsi="Times New Roman"/>
-                <w:sz w:val="20"/>
-              </w:rPr>
-              <w:t>Dhaka Board</w:t>
-            </w:r>
-          </w:p>
-        </w:tc>
-        <w:tc>
-          <w:tcPr>
-            <w:tcW w:type="dxa" w:w="1921"/>
-            <w:tcMar>
-              <w:top w:w="100" w:type="dxa"/>
-              <w:bottom w:w="100" w:type="dxa"/>
-              <w:left w:w="100" w:type="dxa"/>
-              <w:right w:w="100" w:type="dxa"/>
-            </w:tcMar>
-          </w:tcPr>
-          <w:p>
-            <w:r>
-              <w:rPr>
-                <w:rFonts w:ascii="Times New Roman" w:hAnsi="Times New Roman"/>
-                <w:sz w:val="20"/>
-              </w:rPr>
-              <w:t>Science / Business</w:t>
-            </w:r>
-          </w:p>
-        </w:tc>
-        <w:tc>
-          <w:tcPr>
-            <w:tcW w:type="dxa" w:w="1921"/>
-            <w:tcMar>
-              <w:top w:w="100" w:type="dxa"/>
-              <w:bottom w:w="100" w:type="dxa"/>
-              <w:left w:w="100" w:type="dxa"/>
-              <w:right w:w="100" w:type="dxa"/>
-            </w:tcMar>
-          </w:tcPr>
-          <w:p>
-            <w:pPr>
-              <w:jc w:val="center"/>
-            </w:pPr>
-            <w:r>
-              <w:rPr>
-                <w:rFonts w:ascii="Times New Roman" w:hAnsi="Times New Roman"/>
-                <w:sz w:val="20"/>
-              </w:rPr>
-              <w:t>2023</w:t>
-            </w:r>
-          </w:p>
-        </w:tc>
-        <w:tc>
-          <w:tcPr>
-            <w:tcW w:type="dxa" w:w="1921"/>
-            <w:tcMar>
-              <w:top w:w="100" w:type="dxa"/>
-              <w:bottom w:w="100" w:type="dxa"/>
-              <w:left w:w="100" w:type="dxa"/>
-              <w:right w:w="100" w:type="dxa"/>
-            </w:tcMar>
-          </w:tcPr>
-          <w:p>
-            <w:pPr>
-              <w:jc w:val="center"/>
-            </w:pPr>
-            <w:r>
-              <w:rPr>
-                <w:rFonts w:ascii="Times New Roman" w:hAnsi="Times New Roman"/>
-                <w:sz w:val="20"/>
-              </w:rPr>
-              <w:t>GPA 4.50</w:t>
+              <w:t>E-mail: mouree@gmail.com</w:t>
             </w:r>
           </w:p>
         </w:tc>
       </w:tr>
     </w:tbl>
-    <w:p>
-      <w:pPr>
-        <w:spacing w:before="200" w:after="80"/>
-        <w:pBdr>
-          <w:bottom w:val="single" w:sz="12" w:space="2" w:color="2563EB"/>
-        </w:pBdr>
-      </w:pPr>
-      <w:r>
-        <w:rPr>
-          <w:rFonts w:ascii="Times New Roman" w:hAnsi="Times New Roman"/>
-          <w:b/>
-          <w:color w:val="1E3A8A"/>
-          <w:sz w:val="26"/>
-        </w:rPr>
-        <w:t>REFERENCES &amp; PERSONAL DETAILS</w:t>
-      </w:r>
-    </w:p>
-    <w:p>
-      <w:pPr>
-        <w:spacing w:after="40" w:line="276" w:lineRule="auto"/>
-      </w:pPr>
-      <w:r>
-        <w:rPr>
-          <w:rFonts w:ascii="Times New Roman" w:hAnsi="Times New Roman"/>
-          <w:sz w:val="21"/>
-        </w:rPr>
-        <w:t>Reference: Mr. Mouree | Managing Director | Mobile: 01700-000000 | Email: mouree@gmail.com</w:t>
-        <w:br/>
-        <w:t>Nationality: Bangladeshi | Religion: Islam | Gender: Male | Date of Birth: [Your DOB]</w:t>
-      </w:r>
-    </w:p>
     <w:sectPr>
       <w:footerReference w:type="default" r:id="rId9"/>
       <w:pgSz w:w="11909" w:h="16834"/>
-      <w:pgMar w:top="1080" w:right="1152" w:bottom="1080" w:left="1152" w:header="720" w:footer="720" w:gutter="0"/>
+      <w:pgMar w:top="576" w:right="792" w:bottom="576" w:left="792" w:header="720" w:footer="720" w:gutter="0"/>
       <w:cols w:space="720"/>
       <w:docGrid w:linePitch="360"/>
     </w:sectPr>
@@ -673,15 +1044,25 @@
       <w:pStyle w:val="Footer"/>
       <w:jc w:val="right"/>
     </w:pPr>
+    <w:r/>
     <w:r>
       <w:rPr>
         <w:rFonts w:ascii="Times New Roman" w:hAnsi="Times New Roman"/>
-        <w:i/>
-        <w:color w:val="646464"/>
-        <w:sz w:val="18"/>
-      </w:rPr>
-      <w:t>D:\Your Name_Reg No\Job-1.docx</w:t>
+        <w:color w:val="505050"/>
+        <w:sz w:val="19"/>
+      </w:rPr>
+      <w:t xml:space="preserve">D:\Tajrian Islam Sharan_Reg No\Job-1.docx          Page </w:t>
     </w:r>
+    <w:fldSimple w:instr="PAGE">
+      <w:r>
+        <w:rPr>
+          <w:rFonts w:ascii="Times New Roman" w:hAnsi="Times New Roman"/>
+          <w:sz w:val="19"/>
+          <w:color w:val="505050"/>
+        </w:rPr>
+        <w:t>1</w:t>
+      </w:r>
+    </w:fldSimple>
   </w:p>
 </w:ftr>
 </file>

</xml_diff>

<commit_message>
Fix 1-page layout guarantee and make footer path directly editable text
</commit_message>
<xml_diff>
--- a/Job_Sheet_CV_Template.docx
+++ b/Job_Sheet_CV_Template.docx
@@ -10,13 +10,13 @@
         <w:tblLook w:firstColumn="1" w:firstRow="1" w:lastColumn="0" w:lastRow="0" w:noHBand="0" w:noVBand="1" w:val="04A0"/>
       </w:tblPr>
       <w:tblGrid>
-        <w:gridCol w:w="3024"/>
-        <w:gridCol w:w="7272"/>
+        <w:gridCol w:w="2952"/>
+        <w:gridCol w:w="7517"/>
       </w:tblGrid>
       <w:tr>
         <w:tc>
           <w:tcPr>
-            <w:tcW w:type="dxa" w:w="5162"/>
+            <w:tcW w:type="dxa" w:w="5234"/>
             <w:tcBorders>
               <w:top w:val="none"/>
               <w:left w:val="none"/>
@@ -24,15 +24,15 @@
               <w:right w:val="none"/>
             </w:tcBorders>
             <w:tcMar>
-              <w:top w:w="40" w:type="dxa"/>
-              <w:bottom w:w="40" w:type="dxa"/>
-              <w:left w:w="40" w:type="dxa"/>
-              <w:right w:w="40" w:type="dxa"/>
+              <w:top w:w="10" w:type="dxa"/>
+              <w:bottom w:w="10" w:type="dxa"/>
+              <w:left w:w="10" w:type="dxa"/>
+              <w:right w:w="20" w:type="dxa"/>
             </w:tcMar>
           </w:tcPr>
           <w:p>
             <w:pPr>
-              <w:spacing w:before="160" w:after="0"/>
+              <w:spacing w:before="80" w:after="0"/>
               <w:jc w:val="center"/>
             </w:pPr>
             <w:r>
@@ -73,42 +73,44 @@
         </w:tc>
         <w:tc>
           <w:tcPr>
-            <w:tcW w:type="dxa" w:w="5162"/>
+            <w:tcW w:type="dxa" w:w="5234"/>
             <w:tcBorders>
               <w:top w:val="none"/>
               <w:left w:val="none"/>
               <w:bottom w:val="none"/>
               <w:right w:val="none"/>
             </w:tcBorders>
+            <w:tcMar>
+              <w:top w:w="100" w:type="dxa"/>
+              <w:bottom w:w="100" w:type="dxa"/>
+              <w:left w:w="200" w:type="dxa"/>
+              <w:right w:w="140" w:type="dxa"/>
+            </w:tcMar>
             <w:shd w:fill="23272D"/>
-            <w:tcMar>
-              <w:top w:w="160" w:type="dxa"/>
-              <w:bottom w:w="160" w:type="dxa"/>
-              <w:left w:w="240" w:type="dxa"/>
-              <w:right w:w="200" w:type="dxa"/>
-            </w:tcMar>
           </w:tcPr>
           <w:p>
             <w:pPr>
-              <w:spacing w:before="160" w:after="40" w:lineRule="auto" w:line="276"/>
+              <w:spacing w:before="40" w:after="40" w:lineRule="auto" w:line="252"/>
             </w:pPr>
             <w:r>
               <w:rPr>
                 <w:rFonts w:ascii="Times New Roman" w:hAnsi="Times New Roman"/>
                 <w:b/>
                 <w:color w:val="FFFFFF"/>
-                <w:sz w:val="72"/>
+                <w:sz w:val="68"/>
               </w:rPr>
-              <w:t>Tajrian Islam Sharan</w:t>
+              <w:t>Tajrian Islam</w:t>
+              <w:br/>
+              <w:t>Sharan</w:t>
               <w:br/>
             </w:r>
             <w:r>
               <w:rPr>
                 <w:rFonts w:ascii="Times New Roman" w:hAnsi="Times New Roman"/>
-                <w:color w:val="DCE1E6"/>
+                <w:color w:val="E1E6EB"/>
                 <w:sz w:val="28"/>
               </w:rPr>
-              <w:t>Web Designer &amp; Developer</w:t>
+              <w:t>Web Designer</w:t>
             </w:r>
           </w:p>
         </w:tc>
@@ -116,7 +118,12 @@
     </w:tbl>
     <w:p>
       <w:pPr>
-        <w:spacing w:before="80" w:after="80" w:line="240" w:lineRule="auto"/>
+        <w:spacing w:before="40" w:after="80" w:line="40" w:lineRule="exact"/>
+        <w:spacing w:before="0" w:after="0" w:line="20" w:lineRule="exact"/>
+        <w:rPr>
+          <w:sz w:val="2"/>
+          <w:szCs w:val="2"/>
+        </w:rPr>
       </w:pPr>
     </w:p>
     <w:tbl>
@@ -128,12 +135,12 @@
       </w:tblPr>
       <w:tblGrid>
         <w:gridCol w:w="3528"/>
-        <w:gridCol w:w="6768"/>
+        <w:gridCol w:w="6941"/>
       </w:tblGrid>
       <w:tr>
         <w:tc>
           <w:tcPr>
-            <w:tcW w:type="dxa" w:w="5162"/>
+            <w:tcW w:type="dxa" w:w="5234"/>
             <w:tcBorders>
               <w:top w:val="none"/>
               <w:left w:val="none"/>
@@ -141,173 +148,77 @@
               <w:right w:val="none"/>
             </w:tcBorders>
             <w:tcMar>
-              <w:top w:w="20" w:type="dxa"/>
-              <w:bottom w:w="20" w:type="dxa"/>
-              <w:left w:w="20" w:type="dxa"/>
-              <w:right w:w="80" w:type="dxa"/>
+              <w:top w:w="10" w:type="dxa"/>
+              <w:bottom w:w="10" w:type="dxa"/>
+              <w:left w:w="10" w:type="dxa"/>
+              <w:right w:w="60" w:type="dxa"/>
             </w:tcMar>
           </w:tcPr>
-          <w:p/>
           <w:p>
             <w:pPr>
-              <w:spacing w:before="160" w:after="80" w:lineRule="auto" w:line="276"/>
-            </w:pPr>
-          </w:p>
-          <w:tbl>
-            <w:tblPr>
-              <w:tblW w:type="auto" w:w="0"/>
-              <w:jc w:val="left"/>
-              <w:tblLook w:firstColumn="1" w:firstRow="1" w:lastColumn="0" w:lastRow="0" w:noHBand="0" w:noVBand="1" w:val="04A0"/>
-            </w:tblPr>
-            <w:tblGrid>
-              <w:gridCol w:w="5162"/>
-            </w:tblGrid>
-            <w:tr>
-              <w:tc>
-                <w:tcPr>
-                  <w:tcW w:type="dxa" w:w="5162"/>
-                  <w:shd w:fill="23272D"/>
-                  <w:tcBorders>
-                    <w:top w:val="none"/>
-                    <w:left w:val="none"/>
-                    <w:bottom w:val="none"/>
-                    <w:right w:val="none"/>
-                  </w:tcBorders>
-                  <w:tcMar>
-                    <w:top w:w="60" w:type="dxa"/>
-                    <w:bottom w:w="60" w:type="dxa"/>
-                    <w:left w:w="140" w:type="dxa"/>
-                    <w:right w:w="140" w:type="dxa"/>
-                  </w:tcMar>
-                </w:tcPr>
-                <w:p>
-                  <w:pPr>
-                    <w:spacing w:before="40" w:after="40"/>
-                    <w:jc w:val="center"/>
-                  </w:pPr>
-                  <w:r>
-                    <w:rPr>
-                      <w:rFonts w:ascii="Times New Roman" w:hAnsi="Times New Roman"/>
-                      <w:b/>
-                      <w:color w:val="FFFFFF"/>
-                      <w:sz w:val="26"/>
-                    </w:rPr>
-                    <w:t>CONTACT ME</w:t>
-                  </w:r>
-                </w:p>
-              </w:tc>
-            </w:tr>
-          </w:tbl>
-          <w:p/>
-          <w:p>
-            <w:pPr>
-              <w:spacing w:before="40" w:after="40" w:lineRule="auto" w:line="276"/>
-            </w:pPr>
-          </w:p>
-          <w:p>
-            <w:pPr>
-              <w:spacing w:before="40" w:after="40" w:lineRule="auto" w:line="384"/>
+              <w:spacing w:before="120" w:after="60" w:line="280" w:lineRule="exact"/>
+              <w:jc w:val="center"/>
+              <w:shd w:fill="23272D"/>
             </w:pPr>
             <w:r>
               <w:rPr>
                 <w:rFonts w:ascii="Times New Roman" w:hAnsi="Times New Roman"/>
-                <w:color w:val="1E1E1E"/>
-                <w:sz w:val="24"/>
+                <w:b/>
+                <w:color w:val="FFFFFF"/>
+                <w:sz w:val="26"/>
+              </w:rPr>
+              <w:t xml:space="preserve">  CONTACT ME  </w:t>
+            </w:r>
+          </w:p>
+          <w:p>
+            <w:pPr>
+              <w:spacing w:before="40" w:after="80" w:lineRule="auto" w:line="348"/>
+            </w:pPr>
+            <w:r>
+              <w:rPr>
+                <w:rFonts w:ascii="Times New Roman" w:hAnsi="Times New Roman"/>
+                <w:sz w:val="23"/>
               </w:rPr>
               <w:t>Phone: +880 1700-000000</w:t>
+              <w:br/>
+              <w:t>E-mail: tajrianislam1529@gmail.com</w:t>
+              <w:br/>
+              <w:t>Address: Dhaka, Bangladesh</w:t>
+            </w:r>
+          </w:p>
+          <w:p>
+            <w:pPr>
+              <w:spacing w:before="120" w:after="60" w:line="280" w:lineRule="exact"/>
+              <w:jc w:val="center"/>
+              <w:shd w:fill="23272D"/>
+            </w:pPr>
+            <w:r>
+              <w:rPr>
+                <w:rFonts w:ascii="Times New Roman" w:hAnsi="Times New Roman"/>
+                <w:b/>
+                <w:color w:val="FFFFFF"/>
+                <w:sz w:val="26"/>
+              </w:rPr>
+              <w:t xml:space="preserve">  EDUCATION  </w:t>
+            </w:r>
+          </w:p>
+          <w:p>
+            <w:pPr>
+              <w:spacing w:before="40" w:after="80" w:lineRule="auto" w:line="324"/>
+            </w:pPr>
+            <w:r>
+              <w:rPr>
+                <w:rFonts w:ascii="Times New Roman" w:hAnsi="Times New Roman"/>
+                <w:b/>
+                <w:sz w:val="23"/>
+              </w:rPr>
+              <w:t>Secondary School (SSC)</w:t>
               <w:br/>
             </w:r>
             <w:r>
               <w:rPr>
                 <w:rFonts w:ascii="Times New Roman" w:hAnsi="Times New Roman"/>
-                <w:color w:val="1E1E1E"/>
-                <w:sz w:val="24"/>
-              </w:rPr>
-              <w:t>E-mail: tajrianislam1529@gmail.com</w:t>
-              <w:br/>
-            </w:r>
-            <w:r>
-              <w:rPr>
-                <w:rFonts w:ascii="Times New Roman" w:hAnsi="Times New Roman"/>
-                <w:color w:val="1E1E1E"/>
-                <w:sz w:val="24"/>
-              </w:rPr>
-              <w:t>Address: Dhaka, Bangladesh</w:t>
-            </w:r>
-          </w:p>
-          <w:p>
-            <w:pPr>
-              <w:spacing w:before="160" w:after="80" w:lineRule="auto" w:line="276"/>
-            </w:pPr>
-          </w:p>
-          <w:tbl>
-            <w:tblPr>
-              <w:tblW w:type="auto" w:w="0"/>
-              <w:jc w:val="left"/>
-              <w:tblLook w:firstColumn="1" w:firstRow="1" w:lastColumn="0" w:lastRow="0" w:noHBand="0" w:noVBand="1" w:val="04A0"/>
-            </w:tblPr>
-            <w:tblGrid>
-              <w:gridCol w:w="5162"/>
-            </w:tblGrid>
-            <w:tr>
-              <w:tc>
-                <w:tcPr>
-                  <w:tcW w:type="dxa" w:w="5162"/>
-                  <w:shd w:fill="23272D"/>
-                  <w:tcBorders>
-                    <w:top w:val="none"/>
-                    <w:left w:val="none"/>
-                    <w:bottom w:val="none"/>
-                    <w:right w:val="none"/>
-                  </w:tcBorders>
-                  <w:tcMar>
-                    <w:top w:w="60" w:type="dxa"/>
-                    <w:bottom w:w="60" w:type="dxa"/>
-                    <w:left w:w="140" w:type="dxa"/>
-                    <w:right w:w="140" w:type="dxa"/>
-                  </w:tcMar>
-                </w:tcPr>
-                <w:p>
-                  <w:pPr>
-                    <w:spacing w:before="40" w:after="40"/>
-                    <w:jc w:val="center"/>
-                  </w:pPr>
-                  <w:r>
-                    <w:rPr>
-                      <w:rFonts w:ascii="Times New Roman" w:hAnsi="Times New Roman"/>
-                      <w:b/>
-                      <w:color w:val="FFFFFF"/>
-                      <w:sz w:val="26"/>
-                    </w:rPr>
-                    <w:t>EDUCATION</w:t>
-                  </w:r>
-                </w:p>
-              </w:tc>
-            </w:tr>
-          </w:tbl>
-          <w:p/>
-          <w:p>
-            <w:pPr>
-              <w:spacing w:before="40" w:after="40" w:lineRule="auto" w:line="276"/>
-            </w:pPr>
-          </w:p>
-          <w:p>
-            <w:pPr>
-              <w:spacing w:before="40" w:after="40" w:lineRule="auto" w:line="384"/>
-            </w:pPr>
-            <w:r>
-              <w:rPr>
-                <w:rFonts w:ascii="Times New Roman" w:hAnsi="Times New Roman"/>
-                <w:b/>
-                <w:sz w:val="24"/>
-              </w:rPr>
-              <w:t>Secondary School Certificate (SSC)</w:t>
-              <w:br/>
-            </w:r>
-            <w:r>
-              <w:rPr>
-                <w:rFonts w:ascii="Times New Roman" w:hAnsi="Times New Roman"/>
-                <w:sz w:val="24"/>
+                <w:sz w:val="22"/>
               </w:rPr>
               <w:t>Dhaka Board</w:t>
               <w:br/>
@@ -315,7 +226,7 @@
             <w:r>
               <w:rPr>
                 <w:rFonts w:ascii="Times New Roman" w:hAnsi="Times New Roman"/>
-                <w:sz w:val="24"/>
+                <w:sz w:val="22"/>
               </w:rPr>
               <w:t>2016-2018</w:t>
               <w:br/>
@@ -325,15 +236,15 @@
               <w:rPr>
                 <w:rFonts w:ascii="Times New Roman" w:hAnsi="Times New Roman"/>
                 <w:b/>
-                <w:sz w:val="24"/>
+                <w:sz w:val="23"/>
               </w:rPr>
-              <w:t>Higher Secondary Certificate (HSC)</w:t>
+              <w:t>Higher Secondary (HSC)</w:t>
               <w:br/>
             </w:r>
             <w:r>
               <w:rPr>
                 <w:rFonts w:ascii="Times New Roman" w:hAnsi="Times New Roman"/>
-                <w:sz w:val="24"/>
+                <w:sz w:val="22"/>
               </w:rPr>
               <w:t>Dhaka Board</w:t>
               <w:br/>
@@ -341,7 +252,7 @@
             <w:r>
               <w:rPr>
                 <w:rFonts w:ascii="Times New Roman" w:hAnsi="Times New Roman"/>
-                <w:sz w:val="24"/>
+                <w:sz w:val="22"/>
               </w:rPr>
               <w:t>2018-2020</w:t>
               <w:br/>
@@ -351,15 +262,15 @@
               <w:rPr>
                 <w:rFonts w:ascii="Times New Roman" w:hAnsi="Times New Roman"/>
                 <w:b/>
-                <w:sz w:val="24"/>
+                <w:sz w:val="23"/>
               </w:rPr>
-              <w:t>NTVQF Level-3 in Web Design</w:t>
+              <w:t>NTVQF Level-3 Web Design</w:t>
               <w:br/>
             </w:r>
             <w:r>
               <w:rPr>
                 <w:rFonts w:ascii="Times New Roman" w:hAnsi="Times New Roman"/>
-                <w:sz w:val="24"/>
+                <w:sz w:val="22"/>
               </w:rPr>
               <w:t>BTEB Certified</w:t>
               <w:br/>
@@ -367,66 +278,26 @@
             <w:r>
               <w:rPr>
                 <w:rFonts w:ascii="Times New Roman" w:hAnsi="Times New Roman"/>
-                <w:sz w:val="24"/>
+                <w:sz w:val="22"/>
               </w:rPr>
               <w:t>2023-2024</w:t>
             </w:r>
           </w:p>
           <w:p>
             <w:pPr>
-              <w:spacing w:before="160" w:after="80" w:lineRule="auto" w:line="276"/>
+              <w:spacing w:before="120" w:after="60" w:line="280" w:lineRule="exact"/>
+              <w:jc w:val="center"/>
+              <w:shd w:fill="23272D"/>
             </w:pPr>
-          </w:p>
-          <w:tbl>
-            <w:tblPr>
-              <w:tblW w:type="auto" w:w="0"/>
-              <w:jc w:val="left"/>
-              <w:tblLook w:firstColumn="1" w:firstRow="1" w:lastColumn="0" w:lastRow="0" w:noHBand="0" w:noVBand="1" w:val="04A0"/>
-            </w:tblPr>
-            <w:tblGrid>
-              <w:gridCol w:w="5162"/>
-            </w:tblGrid>
-            <w:tr>
-              <w:tc>
-                <w:tcPr>
-                  <w:tcW w:type="dxa" w:w="5162"/>
-                  <w:shd w:fill="23272D"/>
-                  <w:tcBorders>
-                    <w:top w:val="none"/>
-                    <w:left w:val="none"/>
-                    <w:bottom w:val="none"/>
-                    <w:right w:val="none"/>
-                  </w:tcBorders>
-                  <w:tcMar>
-                    <w:top w:w="60" w:type="dxa"/>
-                    <w:bottom w:w="60" w:type="dxa"/>
-                    <w:left w:w="140" w:type="dxa"/>
-                    <w:right w:w="140" w:type="dxa"/>
-                  </w:tcMar>
-                </w:tcPr>
-                <w:p>
-                  <w:pPr>
-                    <w:spacing w:before="40" w:after="40"/>
-                    <w:jc w:val="center"/>
-                  </w:pPr>
-                  <w:r>
-                    <w:rPr>
-                      <w:rFonts w:ascii="Times New Roman" w:hAnsi="Times New Roman"/>
-                      <w:b/>
-                      <w:color w:val="FFFFFF"/>
-                      <w:sz w:val="26"/>
-                    </w:rPr>
-                    <w:t>SKILLS</w:t>
-                  </w:r>
-                </w:p>
-              </w:tc>
-            </w:tr>
-          </w:tbl>
-          <w:p/>
-          <w:p>
-            <w:pPr>
-              <w:spacing w:before="40" w:after="40" w:lineRule="auto" w:line="276"/>
-            </w:pPr>
+            <w:r>
+              <w:rPr>
+                <w:rFonts w:ascii="Times New Roman" w:hAnsi="Times New Roman"/>
+                <w:b/>
+                <w:color w:val="FFFFFF"/>
+                <w:sz w:val="26"/>
+              </w:rPr>
+              <w:t xml:space="preserve">  SKILLS  </w:t>
+            </w:r>
           </w:p>
           <w:tbl>
             <w:tblPr>
@@ -436,12 +307,12 @@
             </w:tblPr>
             <w:tblGrid>
               <w:gridCol w:w="1872"/>
-              <w:gridCol w:w="1440"/>
+              <w:gridCol w:w="1512"/>
             </w:tblGrid>
             <w:tr>
               <w:tc>
                 <w:tcPr>
-                  <w:tcW w:type="dxa" w:w="2581"/>
+                  <w:tcW w:type="dxa" w:w="2617"/>
                   <w:tcBorders>
                     <w:top w:val="none"/>
                     <w:left w:val="none"/>
@@ -449,21 +320,21 @@
                     <w:right w:val="none"/>
                   </w:tcBorders>
                   <w:tcMar>
-                    <w:top w:w="20" w:type="dxa"/>
-                    <w:bottom w:w="20" w:type="dxa"/>
-                    <w:left w:w="10" w:type="dxa"/>
-                    <w:right w:w="10" w:type="dxa"/>
+                    <w:top w:w="8" w:type="dxa"/>
+                    <w:bottom w:w="8" w:type="dxa"/>
+                    <w:left w:w="5" w:type="dxa"/>
+                    <w:right w:w="5" w:type="dxa"/>
                   </w:tcMar>
                 </w:tcPr>
                 <w:p>
                   <w:pPr>
-                    <w:spacing w:before="40" w:after="40" w:lineRule="auto" w:line="384"/>
+                    <w:spacing w:before="20" w:after="20"/>
                   </w:pPr>
                   <w:r>
                     <w:rPr>
                       <w:rFonts w:ascii="Times New Roman" w:hAnsi="Times New Roman"/>
                       <w:b/>
-                      <w:sz w:val="23"/>
+                      <w:sz w:val="22"/>
                     </w:rPr>
                     <w:t>•  UI/UX</w:t>
                   </w:r>
@@ -471,7 +342,7 @@
               </w:tc>
               <w:tc>
                 <w:tcPr>
-                  <w:tcW w:type="dxa" w:w="2581"/>
+                  <w:tcW w:type="dxa" w:w="2617"/>
                   <w:tcBorders>
                     <w:top w:val="none"/>
                     <w:left w:val="none"/>
@@ -479,21 +350,20 @@
                     <w:right w:val="none"/>
                   </w:tcBorders>
                   <w:tcMar>
-                    <w:top w:w="20" w:type="dxa"/>
-                    <w:bottom w:w="20" w:type="dxa"/>
-                    <w:left w:w="10" w:type="dxa"/>
-                    <w:right w:w="10" w:type="dxa"/>
+                    <w:top w:w="8" w:type="dxa"/>
+                    <w:bottom w:w="8" w:type="dxa"/>
+                    <w:left w:w="5" w:type="dxa"/>
+                    <w:right w:w="5" w:type="dxa"/>
                   </w:tcMar>
                 </w:tcPr>
                 <w:p>
                   <w:pPr>
-                    <w:spacing w:before="80" w:after="40"/>
-                    <w:jc w:val="left"/>
+                    <w:spacing w:before="40" w:after="20"/>
                   </w:pPr>
                   <w:r>
                     <w:drawing>
                       <wp:inline xmlns:a="http://schemas.openxmlformats.org/drawingml/2006/main" xmlns:pic="http://schemas.openxmlformats.org/drawingml/2006/picture">
-                        <wp:extent cx="868680" cy="109728"/>
+                        <wp:extent cx="868680" cy="100584"/>
                         <wp:docPr id="2" name="Picture 2"/>
                         <wp:cNvGraphicFramePr>
                           <a:graphicFrameLocks noChangeAspect="1"/>
@@ -514,7 +384,7 @@
                               <pic:spPr>
                                 <a:xfrm>
                                   <a:off x="0" y="0"/>
-                                  <a:ext cx="868680" cy="109728"/>
+                                  <a:ext cx="868680" cy="100584"/>
                                 </a:xfrm>
                                 <a:prstGeom prst="rect"/>
                               </pic:spPr>
@@ -530,7 +400,7 @@
             <w:tr>
               <w:tc>
                 <w:tcPr>
-                  <w:tcW w:type="dxa" w:w="2581"/>
+                  <w:tcW w:type="dxa" w:w="2617"/>
                   <w:tcBorders>
                     <w:top w:val="none"/>
                     <w:left w:val="none"/>
@@ -538,21 +408,21 @@
                     <w:right w:val="none"/>
                   </w:tcBorders>
                   <w:tcMar>
-                    <w:top w:w="20" w:type="dxa"/>
-                    <w:bottom w:w="20" w:type="dxa"/>
-                    <w:left w:w="10" w:type="dxa"/>
-                    <w:right w:w="10" w:type="dxa"/>
+                    <w:top w:w="8" w:type="dxa"/>
+                    <w:bottom w:w="8" w:type="dxa"/>
+                    <w:left w:w="5" w:type="dxa"/>
+                    <w:right w:w="5" w:type="dxa"/>
                   </w:tcMar>
                 </w:tcPr>
                 <w:p>
                   <w:pPr>
-                    <w:spacing w:before="40" w:after="40" w:lineRule="auto" w:line="384"/>
+                    <w:spacing w:before="20" w:after="20"/>
                   </w:pPr>
                   <w:r>
                     <w:rPr>
                       <w:rFonts w:ascii="Times New Roman" w:hAnsi="Times New Roman"/>
                       <w:b/>
-                      <w:sz w:val="23"/>
+                      <w:sz w:val="22"/>
                     </w:rPr>
                     <w:t>•  Visual Design</w:t>
                   </w:r>
@@ -560,7 +430,7 @@
               </w:tc>
               <w:tc>
                 <w:tcPr>
-                  <w:tcW w:type="dxa" w:w="2581"/>
+                  <w:tcW w:type="dxa" w:w="2617"/>
                   <w:tcBorders>
                     <w:top w:val="none"/>
                     <w:left w:val="none"/>
@@ -568,21 +438,20 @@
                     <w:right w:val="none"/>
                   </w:tcBorders>
                   <w:tcMar>
-                    <w:top w:w="20" w:type="dxa"/>
-                    <w:bottom w:w="20" w:type="dxa"/>
-                    <w:left w:w="10" w:type="dxa"/>
-                    <w:right w:w="10" w:type="dxa"/>
+                    <w:top w:w="8" w:type="dxa"/>
+                    <w:bottom w:w="8" w:type="dxa"/>
+                    <w:left w:w="5" w:type="dxa"/>
+                    <w:right w:w="5" w:type="dxa"/>
                   </w:tcMar>
                 </w:tcPr>
                 <w:p>
                   <w:pPr>
-                    <w:spacing w:before="80" w:after="40"/>
-                    <w:jc w:val="left"/>
+                    <w:spacing w:before="40" w:after="20"/>
                   </w:pPr>
                   <w:r>
                     <w:drawing>
                       <wp:inline xmlns:a="http://schemas.openxmlformats.org/drawingml/2006/main" xmlns:pic="http://schemas.openxmlformats.org/drawingml/2006/picture">
-                        <wp:extent cx="868680" cy="109728"/>
+                        <wp:extent cx="868680" cy="100584"/>
                         <wp:docPr id="3" name="Picture 3"/>
                         <wp:cNvGraphicFramePr>
                           <a:graphicFrameLocks noChangeAspect="1"/>
@@ -603,7 +472,7 @@
                               <pic:spPr>
                                 <a:xfrm>
                                   <a:off x="0" y="0"/>
-                                  <a:ext cx="868680" cy="109728"/>
+                                  <a:ext cx="868680" cy="100584"/>
                                 </a:xfrm>
                                 <a:prstGeom prst="rect"/>
                               </pic:spPr>
@@ -619,7 +488,7 @@
             <w:tr>
               <w:tc>
                 <w:tcPr>
-                  <w:tcW w:type="dxa" w:w="2581"/>
+                  <w:tcW w:type="dxa" w:w="2617"/>
                   <w:tcBorders>
                     <w:top w:val="none"/>
                     <w:left w:val="none"/>
@@ -627,21 +496,21 @@
                     <w:right w:val="none"/>
                   </w:tcBorders>
                   <w:tcMar>
-                    <w:top w:w="20" w:type="dxa"/>
-                    <w:bottom w:w="20" w:type="dxa"/>
-                    <w:left w:w="10" w:type="dxa"/>
-                    <w:right w:w="10" w:type="dxa"/>
+                    <w:top w:w="8" w:type="dxa"/>
+                    <w:bottom w:w="8" w:type="dxa"/>
+                    <w:left w:w="5" w:type="dxa"/>
+                    <w:right w:w="5" w:type="dxa"/>
                   </w:tcMar>
                 </w:tcPr>
                 <w:p>
                   <w:pPr>
-                    <w:spacing w:before="40" w:after="40" w:lineRule="auto" w:line="384"/>
+                    <w:spacing w:before="20" w:after="20"/>
                   </w:pPr>
                   <w:r>
                     <w:rPr>
                       <w:rFonts w:ascii="Times New Roman" w:hAnsi="Times New Roman"/>
                       <w:b/>
-                      <w:sz w:val="23"/>
+                      <w:sz w:val="22"/>
                     </w:rPr>
                     <w:t>•  User Flows</w:t>
                   </w:r>
@@ -649,7 +518,7 @@
               </w:tc>
               <w:tc>
                 <w:tcPr>
-                  <w:tcW w:type="dxa" w:w="2581"/>
+                  <w:tcW w:type="dxa" w:w="2617"/>
                   <w:tcBorders>
                     <w:top w:val="none"/>
                     <w:left w:val="none"/>
@@ -657,21 +526,20 @@
                     <w:right w:val="none"/>
                   </w:tcBorders>
                   <w:tcMar>
-                    <w:top w:w="20" w:type="dxa"/>
-                    <w:bottom w:w="20" w:type="dxa"/>
-                    <w:left w:w="10" w:type="dxa"/>
-                    <w:right w:w="10" w:type="dxa"/>
+                    <w:top w:w="8" w:type="dxa"/>
+                    <w:bottom w:w="8" w:type="dxa"/>
+                    <w:left w:w="5" w:type="dxa"/>
+                    <w:right w:w="5" w:type="dxa"/>
                   </w:tcMar>
                 </w:tcPr>
                 <w:p>
                   <w:pPr>
-                    <w:spacing w:before="80" w:after="40"/>
-                    <w:jc w:val="left"/>
+                    <w:spacing w:before="40" w:after="20"/>
                   </w:pPr>
                   <w:r>
                     <w:drawing>
                       <wp:inline xmlns:a="http://schemas.openxmlformats.org/drawingml/2006/main" xmlns:pic="http://schemas.openxmlformats.org/drawingml/2006/picture">
-                        <wp:extent cx="868680" cy="109728"/>
+                        <wp:extent cx="868680" cy="100584"/>
                         <wp:docPr id="4" name="Picture 4"/>
                         <wp:cNvGraphicFramePr>
                           <a:graphicFrameLocks noChangeAspect="1"/>
@@ -692,7 +560,7 @@
                               <pic:spPr>
                                 <a:xfrm>
                                   <a:off x="0" y="0"/>
-                                  <a:ext cx="868680" cy="109728"/>
+                                  <a:ext cx="868680" cy="100584"/>
                                 </a:xfrm>
                                 <a:prstGeom prst="rect"/>
                               </pic:spPr>
@@ -708,7 +576,7 @@
             <w:tr>
               <w:tc>
                 <w:tcPr>
-                  <w:tcW w:type="dxa" w:w="2581"/>
+                  <w:tcW w:type="dxa" w:w="2617"/>
                   <w:tcBorders>
                     <w:top w:val="none"/>
                     <w:left w:val="none"/>
@@ -716,21 +584,21 @@
                     <w:right w:val="none"/>
                   </w:tcBorders>
                   <w:tcMar>
-                    <w:top w:w="20" w:type="dxa"/>
-                    <w:bottom w:w="20" w:type="dxa"/>
-                    <w:left w:w="10" w:type="dxa"/>
-                    <w:right w:w="10" w:type="dxa"/>
+                    <w:top w:w="8" w:type="dxa"/>
+                    <w:bottom w:w="8" w:type="dxa"/>
+                    <w:left w:w="5" w:type="dxa"/>
+                    <w:right w:w="5" w:type="dxa"/>
                   </w:tcMar>
                 </w:tcPr>
                 <w:p>
                   <w:pPr>
-                    <w:spacing w:before="40" w:after="40" w:lineRule="auto" w:line="384"/>
+                    <w:spacing w:before="20" w:after="20"/>
                   </w:pPr>
                   <w:r>
                     <w:rPr>
                       <w:rFonts w:ascii="Times New Roman" w:hAnsi="Times New Roman"/>
                       <w:b/>
-                      <w:sz w:val="23"/>
+                      <w:sz w:val="22"/>
                     </w:rPr>
                     <w:t>•  Process Flows</w:t>
                   </w:r>
@@ -738,7 +606,7 @@
               </w:tc>
               <w:tc>
                 <w:tcPr>
-                  <w:tcW w:type="dxa" w:w="2581"/>
+                  <w:tcW w:type="dxa" w:w="2617"/>
                   <w:tcBorders>
                     <w:top w:val="none"/>
                     <w:left w:val="none"/>
@@ -746,21 +614,20 @@
                     <w:right w:val="none"/>
                   </w:tcBorders>
                   <w:tcMar>
-                    <w:top w:w="20" w:type="dxa"/>
-                    <w:bottom w:w="20" w:type="dxa"/>
-                    <w:left w:w="10" w:type="dxa"/>
-                    <w:right w:w="10" w:type="dxa"/>
+                    <w:top w:w="8" w:type="dxa"/>
+                    <w:bottom w:w="8" w:type="dxa"/>
+                    <w:left w:w="5" w:type="dxa"/>
+                    <w:right w:w="5" w:type="dxa"/>
                   </w:tcMar>
                 </w:tcPr>
                 <w:p>
                   <w:pPr>
-                    <w:spacing w:before="80" w:after="40"/>
-                    <w:jc w:val="left"/>
+                    <w:spacing w:before="40" w:after="20"/>
                   </w:pPr>
                   <w:r>
                     <w:drawing>
                       <wp:inline xmlns:a="http://schemas.openxmlformats.org/drawingml/2006/main" xmlns:pic="http://schemas.openxmlformats.org/drawingml/2006/picture">
-                        <wp:extent cx="868680" cy="109728"/>
+                        <wp:extent cx="868680" cy="100584"/>
                         <wp:docPr id="5" name="Picture 5"/>
                         <wp:cNvGraphicFramePr>
                           <a:graphicFrameLocks noChangeAspect="1"/>
@@ -781,7 +648,7 @@
                               <pic:spPr>
                                 <a:xfrm>
                                   <a:off x="0" y="0"/>
-                                  <a:ext cx="868680" cy="109728"/>
+                                  <a:ext cx="868680" cy="100584"/>
                                 </a:xfrm>
                                 <a:prstGeom prst="rect"/>
                               </pic:spPr>
@@ -799,7 +666,7 @@
         </w:tc>
         <w:tc>
           <w:tcPr>
-            <w:tcW w:type="dxa" w:w="5162"/>
+            <w:tcW w:type="dxa" w:w="5234"/>
             <w:tcBorders>
               <w:top w:val="none"/>
               <w:left w:val="none"/>
@@ -807,16 +674,15 @@
               <w:right w:val="none"/>
             </w:tcBorders>
             <w:tcMar>
-              <w:top w:w="20" w:type="dxa"/>
-              <w:bottom w:w="20" w:type="dxa"/>
-              <w:left w:w="80" w:type="dxa"/>
-              <w:right w:w="20" w:type="dxa"/>
+              <w:top w:w="10" w:type="dxa"/>
+              <w:bottom w:w="10" w:type="dxa"/>
+              <w:left w:w="60" w:type="dxa"/>
+              <w:right w:w="10" w:type="dxa"/>
             </w:tcMar>
           </w:tcPr>
-          <w:p/>
           <w:p>
             <w:pPr>
-              <w:spacing w:before="160" w:after="120"/>
+              <w:spacing w:before="80" w:after="80"/>
             </w:pPr>
             <w:r>
               <w:rPr>
@@ -830,21 +696,21 @@
               <w:rPr>
                 <w:rFonts w:ascii="Times New Roman" w:hAnsi="Times New Roman"/>
                 <w:b/>
-                <w:color w:val="323232"/>
-                <w:sz w:val="28"/>
+                <w:color w:val="282828"/>
+                <w:sz w:val="26"/>
               </w:rPr>
               <w:t>________________________________________</w:t>
             </w:r>
           </w:p>
           <w:p>
             <w:pPr>
-              <w:spacing w:before="80" w:after="80" w:lineRule="auto" w:line="384"/>
+              <w:spacing w:before="40" w:after="80" w:lineRule="auto" w:line="336"/>
             </w:pPr>
             <w:r>
               <w:rPr>
                 <w:rFonts w:ascii="Times New Roman" w:hAnsi="Times New Roman"/>
                 <w:b/>
-                <w:sz w:val="20"/>
+                <w:sz w:val="19"/>
               </w:rPr>
               <w:t xml:space="preserve">■  </w:t>
             </w:r>
@@ -860,15 +726,15 @@
             <w:r>
               <w:rPr>
                 <w:rFonts w:ascii="Times New Roman" w:hAnsi="Times New Roman"/>
-                <w:sz w:val="24"/>
+                <w:sz w:val="23"/>
               </w:rPr>
-              <w:t xml:space="preserve">    Creative IT &amp; Tech</w:t>
+              <w:t xml:space="preserve">    Creative IT Solutions</w:t>
               <w:br/>
             </w:r>
             <w:r>
               <w:rPr>
                 <w:rFonts w:ascii="Times New Roman" w:hAnsi="Times New Roman"/>
-                <w:sz w:val="24"/>
+                <w:sz w:val="23"/>
               </w:rPr>
               <w:t xml:space="preserve">    2022-2024</w:t>
               <w:br/>
@@ -878,7 +744,7 @@
               <w:rPr>
                 <w:rFonts w:ascii="Times New Roman" w:hAnsi="Times New Roman"/>
                 <w:b/>
-                <w:sz w:val="20"/>
+                <w:sz w:val="19"/>
               </w:rPr>
               <w:t xml:space="preserve">■  </w:t>
             </w:r>
@@ -894,15 +760,15 @@
             <w:r>
               <w:rPr>
                 <w:rFonts w:ascii="Times New Roman" w:hAnsi="Times New Roman"/>
-                <w:sz w:val="24"/>
+                <w:sz w:val="23"/>
               </w:rPr>
-              <w:t xml:space="preserve">    Apex Soft Solutions</w:t>
+              <w:t xml:space="preserve">    Apex Soft Labs</w:t>
               <w:br/>
             </w:r>
             <w:r>
               <w:rPr>
                 <w:rFonts w:ascii="Times New Roman" w:hAnsi="Times New Roman"/>
-                <w:sz w:val="24"/>
+                <w:sz w:val="23"/>
               </w:rPr>
               <w:t xml:space="preserve">    2020-2022</w:t>
               <w:br/>
@@ -912,7 +778,7 @@
               <w:rPr>
                 <w:rFonts w:ascii="Times New Roman" w:hAnsi="Times New Roman"/>
                 <w:b/>
-                <w:sz w:val="20"/>
+                <w:sz w:val="19"/>
               </w:rPr>
               <w:t xml:space="preserve">■  </w:t>
             </w:r>
@@ -928,7 +794,7 @@
             <w:r>
               <w:rPr>
                 <w:rFonts w:ascii="Times New Roman" w:hAnsi="Times New Roman"/>
-                <w:sz w:val="24"/>
+                <w:sz w:val="23"/>
               </w:rPr>
               <w:t xml:space="preserve">    WebCraft Agency</w:t>
               <w:br/>
@@ -936,90 +802,41 @@
             <w:r>
               <w:rPr>
                 <w:rFonts w:ascii="Times New Roman" w:hAnsi="Times New Roman"/>
-                <w:sz w:val="24"/>
+                <w:sz w:val="23"/>
               </w:rPr>
               <w:t xml:space="preserve">    2018-2020</w:t>
             </w:r>
           </w:p>
-          <w:tbl>
-            <w:tblPr>
-              <w:tblW w:type="auto" w:w="0"/>
-              <w:jc w:val="center"/>
-              <w:tblLayout w:type="fixed"/>
-              <w:tblLook w:firstColumn="1" w:firstRow="1" w:lastColumn="0" w:lastRow="0" w:noHBand="0" w:noVBand="1" w:val="04A0"/>
-            </w:tblPr>
-            <w:tblGrid>
-              <w:gridCol w:w="6696"/>
-            </w:tblGrid>
-            <w:tr>
-              <w:tc>
-                <w:tcPr>
-                  <w:tcW w:type="dxa" w:w="5162"/>
-                  <w:shd w:fill="23272D"/>
-                  <w:tcBorders>
-                    <w:top w:val="none"/>
-                    <w:left w:val="none"/>
-                    <w:bottom w:val="none"/>
-                    <w:right w:val="none"/>
-                  </w:tcBorders>
-                  <w:tcMar>
-                    <w:top w:w="60" w:type="dxa"/>
-                    <w:bottom w:w="60" w:type="dxa"/>
-                    <w:left w:w="140" w:type="dxa"/>
-                    <w:right w:w="140" w:type="dxa"/>
-                  </w:tcMar>
-                </w:tcPr>
-                <w:p>
-                  <w:pPr>
-                    <w:spacing w:before="40" w:after="40"/>
-                  </w:pPr>
-                  <w:r>
-                    <w:rPr>
-                      <w:rFonts w:ascii="Times New Roman" w:hAnsi="Times New Roman"/>
-                      <w:b/>
-                      <w:color w:val="FFFFFF"/>
-                      <w:sz w:val="28"/>
-                    </w:rPr>
-                    <w:t>Reference:</w:t>
-                  </w:r>
-                </w:p>
-              </w:tc>
-            </w:tr>
-          </w:tbl>
-          <w:p/>
           <w:p>
             <w:pPr>
-              <w:spacing w:before="120" w:after="40" w:lineRule="auto" w:line="384"/>
+              <w:spacing w:before="200" w:after="80" w:line="300" w:lineRule="exact"/>
+              <w:shd w:fill="23272D"/>
             </w:pPr>
             <w:r>
               <w:rPr>
                 <w:rFonts w:ascii="Times New Roman" w:hAnsi="Times New Roman"/>
-                <w:sz w:val="24"/>
+                <w:b/>
+                <w:color w:val="FFFFFF"/>
+                <w:sz w:val="26"/>
+              </w:rPr>
+              <w:t xml:space="preserve">  Reference:  </w:t>
+            </w:r>
+          </w:p>
+          <w:p>
+            <w:pPr>
+              <w:spacing w:before="40" w:after="40" w:lineRule="auto" w:line="348"/>
+            </w:pPr>
+            <w:r>
+              <w:rPr>
+                <w:rFonts w:ascii="Times New Roman" w:hAnsi="Times New Roman"/>
+                <w:sz w:val="23"/>
               </w:rPr>
               <w:t>Name: Mr. Mouree</w:t>
               <w:br/>
-            </w:r>
-            <w:r>
-              <w:rPr>
-                <w:rFonts w:ascii="Times New Roman" w:hAnsi="Times New Roman"/>
-                <w:sz w:val="24"/>
-              </w:rPr>
               <w:t>Designation: Managing Director</w:t>
               <w:br/>
-            </w:r>
-            <w:r>
-              <w:rPr>
-                <w:rFonts w:ascii="Times New Roman" w:hAnsi="Times New Roman"/>
-                <w:sz w:val="24"/>
-              </w:rPr>
               <w:t>Mobile: 01xxxxxxxxx</w:t>
               <w:br/>
-            </w:r>
-            <w:r>
-              <w:rPr>
-                <w:rFonts w:ascii="Times New Roman" w:hAnsi="Times New Roman"/>
-                <w:sz w:val="24"/>
-              </w:rPr>
               <w:t>E-mail: mouree@gmail.com</w:t>
             </w:r>
           </w:p>
@@ -1029,7 +846,7 @@
     <w:sectPr>
       <w:footerReference w:type="default" r:id="rId9"/>
       <w:pgSz w:w="11909" w:h="16834"/>
-      <w:pgMar w:top="576" w:right="792" w:bottom="576" w:left="792" w:header="720" w:footer="720" w:gutter="0"/>
+      <w:pgMar w:top="504" w:right="720" w:bottom="504" w:left="720" w:header="720" w:footer="720" w:gutter="0"/>
       <w:cols w:space="720"/>
       <w:docGrid w:linePitch="360"/>
     </w:sectPr>
@@ -1048,21 +865,11 @@
     <w:r>
       <w:rPr>
         <w:rFonts w:ascii="Times New Roman" w:hAnsi="Times New Roman"/>
-        <w:color w:val="505050"/>
+        <w:color w:val="3C3C3C"/>
         <w:sz w:val="19"/>
       </w:rPr>
-      <w:t xml:space="preserve">D:\Tajrian Islam Sharan_Reg No\Job-1.docx          Page </w:t>
+      <w:t>D:\Tajrian Islam Sharan_Reg No\Job-1.docx                    1</w:t>
     </w:r>
-    <w:fldSimple w:instr="PAGE">
-      <w:r>
-        <w:rPr>
-          <w:rFonts w:ascii="Times New Roman" w:hAnsi="Times New Roman"/>
-          <w:sz w:val="19"/>
-          <w:color w:val="505050"/>
-        </w:rPr>
-        <w:t>1</w:t>
-      </w:r>
-    </w:fldSimple>
   </w:p>
 </w:ftr>
 </file>

</xml_diff>

<commit_message>
Convert boxes and progress bars to native Word shapes so size and color can be edited directly
</commit_message>
<xml_diff>
--- a/Job_Sheet_CV_Template.docx
+++ b/Job_Sheet_CV_Template.docx
@@ -27,7 +27,7 @@
               <w:top w:w="10" w:type="dxa"/>
               <w:bottom w:w="10" w:type="dxa"/>
               <w:left w:w="10" w:type="dxa"/>
-              <w:right w:w="20" w:type="dxa"/>
+              <w:right w:w="10" w:type="dxa"/>
             </w:tcMar>
           </w:tcPr>
           <w:p>
@@ -81,36 +81,83 @@
               <w:right w:val="none"/>
             </w:tcBorders>
             <w:tcMar>
-              <w:top w:w="100" w:type="dxa"/>
-              <w:bottom w:w="100" w:type="dxa"/>
-              <w:left w:w="200" w:type="dxa"/>
-              <w:right w:w="140" w:type="dxa"/>
+              <w:top w:w="10" w:type="dxa"/>
+              <w:bottom w:w="10" w:type="dxa"/>
+              <w:left w:w="10" w:type="dxa"/>
+              <w:right w:w="10" w:type="dxa"/>
             </w:tcMar>
-            <w:shd w:fill="23272D"/>
           </w:tcPr>
           <w:p>
             <w:pPr>
-              <w:spacing w:before="40" w:after="40" w:lineRule="auto" w:line="252"/>
+              <w:spacing w:before="40" w:after="0"/>
             </w:pPr>
-            <w:r>
-              <w:rPr>
-                <w:rFonts w:ascii="Times New Roman" w:hAnsi="Times New Roman"/>
-                <w:b/>
-                <w:color w:val="FFFFFF"/>
-                <w:sz w:val="68"/>
-              </w:rPr>
-              <w:t>Tajrian Islam</w:t>
-              <w:br/>
-              <w:t>Sharan</w:t>
-              <w:br/>
-            </w:r>
-            <w:r>
-              <w:rPr>
-                <w:rFonts w:ascii="Times New Roman" w:hAnsi="Times New Roman"/>
-                <w:color w:val="E1E6EB"/>
-                <w:sz w:val="28"/>
-              </w:rPr>
-              <w:t>Web Designer</w:t>
+            <w:r xmlns:a="http://schemas.openxmlformats.org/drawingml/2006/main">
+              <w:drawing>
+                <wp:inline distT="0" distB="0" distL="0" distR="0">
+                  <wp:extent cx="4663440" cy="1600200"/>
+                  <wp:effectExtent l="0" t="0" r="0" b="0"/>
+                  <wp:docPr id="101" name="TopBannerShape"/>
+                  <wp:cNvGraphicFramePr/>
+                  <a:graphic>
+                    <a:graphicData uri="http://schemas.microsoft.com/office/word/2010/wordprocessingShape">
+                      <wps:wsp>
+                        <wps:cNvSpPr/>
+                        <wps:spPr>
+                          <a:xfrm>
+                            <a:off x="0" y="0"/>
+                            <a:ext cx="4663440" cy="1600200"/>
+                          </a:xfrm>
+                          <a:prstGeom prst="roundRect">
+                            <a:avLst>
+                              <a:gd name="adj" fmla="val 15000"/>
+                            </a:avLst>
+                          </a:prstGeom>
+                          <a:solidFill>
+                            <a:srgbClr val="23272D"/>
+                          </a:solidFill>
+                          <a:ln>
+                            <a:noFill/>
+                          </a:ln>
+                        </wps:spPr>
+                        <wps:txbx>
+                          <w:txbxContent>
+                            <w:p>
+                              <w:pPr>
+                                <w:jc w:val="left"/>
+                                <w:spacing w:before="60" w:after="20"/>
+                              </w:pPr>
+                              <w:r>
+                                <w:rPr>
+                                  <w:rFonts w:ascii="Times New Roman" w:hAnsi="Times New Roman"/>
+                                  <w:b/>
+                                  <w:sz w:val="68"/>
+                                  <w:color w:val="FFFFFF"/>
+                                </w:rPr>
+                                <w:t>Tajrian Islam Sharan</w:t>
+                              </w:r>
+                            </w:p>
+                            <w:p>
+                              <w:pPr>
+                                <w:jc w:val="left"/>
+                                <w:spacing w:before="0" w:after="0"/>
+                              </w:pPr>
+                              <w:r>
+                                <w:rPr>
+                                  <w:rFonts w:ascii="Times New Roman" w:hAnsi="Times New Roman"/>
+                                  <w:sz w:val="28"/>
+                                  <w:color w:val="E0E6ED"/>
+                                </w:rPr>
+                                <w:t>Web Designer &amp; Developer</w:t>
+                              </w:r>
+                            </w:p>
+                          </w:txbxContent>
+                        </wps:txbx>
+                        <wps:bodyPr vert="horz" lIns="100000" tIns="40000" rIns="100000" bIns="40000" anchor="ctr"/>
+                      </wps:wsp>
+                    </a:graphicData>
+                  </a:graphic>
+                </wp:inline>
+              </w:drawing>
             </w:r>
           </w:p>
         </w:tc>
@@ -118,7 +165,7 @@
     </w:tbl>
     <w:p>
       <w:pPr>
-        <w:spacing w:before="40" w:after="80" w:line="40" w:lineRule="exact"/>
+        <w:spacing w:before="40" w:after="40" w:line="40" w:lineRule="exact"/>
         <w:spacing w:before="0" w:after="0" w:line="20" w:lineRule="exact"/>
         <w:rPr>
           <w:sz w:val="2"/>
@@ -151,23 +198,175 @@
               <w:top w:w="10" w:type="dxa"/>
               <w:bottom w:w="10" w:type="dxa"/>
               <w:left w:w="10" w:type="dxa"/>
-              <w:right w:w="60" w:type="dxa"/>
+              <w:right w:w="40" w:type="dxa"/>
             </w:tcMar>
           </w:tcPr>
           <w:p>
             <w:pPr>
               <w:spacing w:before="120" w:after="60" w:line="280" w:lineRule="exact"/>
               <w:jc w:val="center"/>
-              <w:shd w:fill="23272D"/>
             </w:pPr>
-            <w:r>
-              <w:rPr>
-                <w:rFonts w:ascii="Times New Roman" w:hAnsi="Times New Roman"/>
-                <w:b/>
-                <w:color w:val="FFFFFF"/>
-                <w:sz w:val="26"/>
-              </w:rPr>
-              <w:t xml:space="preserve">  CONTACT ME  </w:t>
+            <w:r xmlns:a="http://schemas.openxmlformats.org/drawingml/2006/main">
+              <w:drawing>
+                <wp:inline distT="0" distB="0" distL="0" distR="0">
+                  <wp:extent cx="2103120" cy="310896"/>
+                  <wp:effectExtent l="0" t="0" r="0" b="0"/>
+                  <wp:docPr id="201" name="Btn_CONTACT ME"/>
+                  <wp:cNvGraphicFramePr/>
+                  <a:graphic>
+                    <a:graphicData uri="http://schemas.microsoft.com/office/word/2010/wordprocessingShape">
+                      <wps:wsp>
+                        <wps:cNvSpPr/>
+                        <wps:spPr>
+                          <a:xfrm>
+                            <a:off x="0" y="0"/>
+                            <a:ext cx="2103120" cy="310896"/>
+                          </a:xfrm>
+                          <a:prstGeom prst="roundRect">
+                            <a:avLst>
+                              <a:gd name="adj" fmla="val 22000"/>
+                            </a:avLst>
+                          </a:prstGeom>
+                          <a:solidFill>
+                            <a:srgbClr val="23272D"/>
+                          </a:solidFill>
+                          <a:ln>
+                            <a:noFill/>
+                          </a:ln>
+                        </wps:spPr>
+                        <wps:txbx>
+                          <w:txbxContent>
+                            <w:p>
+                              <w:pPr>
+                                <w:jc w:val="center"/>
+                                <w:spacing w:before="15" w:after="15"/>
+                              </w:pPr>
+                              <w:r>
+                                <w:rPr>
+                                  <w:rFonts w:ascii="Times New Roman" w:hAnsi="Times New Roman"/>
+                                  <w:b/>
+                                  <w:sz w:val="25"/>
+                                  <w:color w:val="FFFFFF"/>
+                                </w:rPr>
+                                <w:t>CONTACT ME</w:t>
+                              </w:r>
+                            </w:p>
+                          </w:txbxContent>
+                        </wps:txbx>
+                        <wps:bodyPr vert="horz" lIns="100000" tIns="40000" rIns="100000" bIns="40000" anchor="ctr"/>
+                      </wps:wsp>
+                    </a:graphicData>
+                  </a:graphic>
+                </wp:inline>
+              </w:drawing>
+            </w:r>
+            <w:r xmlns:a="http://schemas.openxmlformats.org/drawingml/2006/main">
+              <w:drawing>
+                <wp:inline distT="0" distB="0" distL="0" distR="0">
+                  <wp:extent cx="2103120" cy="310896"/>
+                  <wp:effectExtent l="0" t="0" r="0" b="0"/>
+                  <wp:docPr id="202" name="Btn_EDUCATION"/>
+                  <wp:cNvGraphicFramePr/>
+                  <a:graphic>
+                    <a:graphicData uri="http://schemas.microsoft.com/office/word/2010/wordprocessingShape">
+                      <wps:wsp>
+                        <wps:cNvSpPr/>
+                        <wps:spPr>
+                          <a:xfrm>
+                            <a:off x="0" y="0"/>
+                            <a:ext cx="2103120" cy="310896"/>
+                          </a:xfrm>
+                          <a:prstGeom prst="roundRect">
+                            <a:avLst>
+                              <a:gd name="adj" fmla="val 22000"/>
+                            </a:avLst>
+                          </a:prstGeom>
+                          <a:solidFill>
+                            <a:srgbClr val="23272D"/>
+                          </a:solidFill>
+                          <a:ln>
+                            <a:noFill/>
+                          </a:ln>
+                        </wps:spPr>
+                        <wps:txbx>
+                          <w:txbxContent>
+                            <w:p>
+                              <w:pPr>
+                                <w:jc w:val="center"/>
+                                <w:spacing w:before="15" w:after="15"/>
+                              </w:pPr>
+                              <w:r>
+                                <w:rPr>
+                                  <w:rFonts w:ascii="Times New Roman" w:hAnsi="Times New Roman"/>
+                                  <w:b/>
+                                  <w:sz w:val="25"/>
+                                  <w:color w:val="FFFFFF"/>
+                                </w:rPr>
+                                <w:t>EDUCATION</w:t>
+                              </w:r>
+                            </w:p>
+                          </w:txbxContent>
+                        </wps:txbx>
+                        <wps:bodyPr vert="horz" lIns="100000" tIns="40000" rIns="100000" bIns="40000" anchor="ctr"/>
+                      </wps:wsp>
+                    </a:graphicData>
+                  </a:graphic>
+                </wp:inline>
+              </w:drawing>
+            </w:r>
+            <w:r xmlns:a="http://schemas.openxmlformats.org/drawingml/2006/main">
+              <w:drawing>
+                <wp:inline distT="0" distB="0" distL="0" distR="0">
+                  <wp:extent cx="2103120" cy="310896"/>
+                  <wp:effectExtent l="0" t="0" r="0" b="0"/>
+                  <wp:docPr id="203" name="Btn_SKILLS"/>
+                  <wp:cNvGraphicFramePr/>
+                  <a:graphic>
+                    <a:graphicData uri="http://schemas.microsoft.com/office/word/2010/wordprocessingShape">
+                      <wps:wsp>
+                        <wps:cNvSpPr/>
+                        <wps:spPr>
+                          <a:xfrm>
+                            <a:off x="0" y="0"/>
+                            <a:ext cx="2103120" cy="310896"/>
+                          </a:xfrm>
+                          <a:prstGeom prst="roundRect">
+                            <a:avLst>
+                              <a:gd name="adj" fmla="val 22000"/>
+                            </a:avLst>
+                          </a:prstGeom>
+                          <a:solidFill>
+                            <a:srgbClr val="23272D"/>
+                          </a:solidFill>
+                          <a:ln>
+                            <a:noFill/>
+                          </a:ln>
+                        </wps:spPr>
+                        <wps:txbx>
+                          <w:txbxContent>
+                            <w:p>
+                              <w:pPr>
+                                <w:jc w:val="center"/>
+                                <w:spacing w:before="15" w:after="15"/>
+                              </w:pPr>
+                              <w:r>
+                                <w:rPr>
+                                  <w:rFonts w:ascii="Times New Roman" w:hAnsi="Times New Roman"/>
+                                  <w:b/>
+                                  <w:sz w:val="25"/>
+                                  <w:color w:val="FFFFFF"/>
+                                </w:rPr>
+                                <w:t>SKILLS</w:t>
+                              </w:r>
+                            </w:p>
+                          </w:txbxContent>
+                        </wps:txbx>
+                        <wps:bodyPr vert="horz" lIns="100000" tIns="40000" rIns="100000" bIns="40000" anchor="ctr"/>
+                      </wps:wsp>
+                    </a:graphicData>
+                  </a:graphic>
+                </wp:inline>
+              </w:drawing>
             </w:r>
           </w:p>
           <w:p>
@@ -184,22 +383,6 @@
               <w:t>E-mail: tajrianislam1529@gmail.com</w:t>
               <w:br/>
               <w:t>Address: Dhaka, Bangladesh</w:t>
-            </w:r>
-          </w:p>
-          <w:p>
-            <w:pPr>
-              <w:spacing w:before="120" w:after="60" w:line="280" w:lineRule="exact"/>
-              <w:jc w:val="center"/>
-              <w:shd w:fill="23272D"/>
-            </w:pPr>
-            <w:r>
-              <w:rPr>
-                <w:rFonts w:ascii="Times New Roman" w:hAnsi="Times New Roman"/>
-                <w:b/>
-                <w:color w:val="FFFFFF"/>
-                <w:sz w:val="26"/>
-              </w:rPr>
-              <w:t xml:space="preserve">  EDUCATION  </w:t>
             </w:r>
           </w:p>
           <w:p>
@@ -283,22 +466,6 @@
               <w:t>2023-2024</w:t>
             </w:r>
           </w:p>
-          <w:p>
-            <w:pPr>
-              <w:spacing w:before="120" w:after="60" w:line="280" w:lineRule="exact"/>
-              <w:jc w:val="center"/>
-              <w:shd w:fill="23272D"/>
-            </w:pPr>
-            <w:r>
-              <w:rPr>
-                <w:rFonts w:ascii="Times New Roman" w:hAnsi="Times New Roman"/>
-                <w:b/>
-                <w:color w:val="FFFFFF"/>
-                <w:sz w:val="26"/>
-              </w:rPr>
-              <w:t xml:space="preserve">  SKILLS  </w:t>
-            </w:r>
-          </w:p>
           <w:tbl>
             <w:tblPr>
               <w:tblW w:type="auto" w:w="0"/>
@@ -320,8 +487,8 @@
                     <w:right w:val="none"/>
                   </w:tcBorders>
                   <w:tcMar>
-                    <w:top w:w="8" w:type="dxa"/>
-                    <w:bottom w:w="8" w:type="dxa"/>
+                    <w:top w:w="6" w:type="dxa"/>
+                    <w:bottom w:w="6" w:type="dxa"/>
                     <w:left w:w="5" w:type="dxa"/>
                     <w:right w:w="5" w:type="dxa"/>
                   </w:tcMar>
@@ -350,8 +517,8 @@
                     <w:right w:val="none"/>
                   </w:tcBorders>
                   <w:tcMar>
-                    <w:top w:w="8" w:type="dxa"/>
-                    <w:bottom w:w="8" w:type="dxa"/>
+                    <w:top w:w="6" w:type="dxa"/>
+                    <w:bottom w:w="6" w:type="dxa"/>
                     <w:left w:w="5" w:type="dxa"/>
                     <w:right w:w="5" w:type="dxa"/>
                   </w:tcMar>
@@ -360,35 +527,36 @@
                   <w:pPr>
                     <w:spacing w:before="40" w:after="20"/>
                   </w:pPr>
-                  <w:r>
+                  <w:r xmlns:a="http://schemas.openxmlformats.org/drawingml/2006/main">
                     <w:drawing>
-                      <wp:inline xmlns:a="http://schemas.openxmlformats.org/drawingml/2006/main" xmlns:pic="http://schemas.openxmlformats.org/drawingml/2006/picture">
-                        <wp:extent cx="868680" cy="100584"/>
-                        <wp:docPr id="2" name="Picture 2"/>
-                        <wp:cNvGraphicFramePr>
-                          <a:graphicFrameLocks noChangeAspect="1"/>
-                        </wp:cNvGraphicFramePr>
+                      <wp:inline distT="0" distB="0" distL="0" distR="0">
+                        <wp:extent cx="740664" cy="118872"/>
+                        <wp:effectExtent l="0" t="0" r="0" b="0"/>
+                        <wp:docPr id="301" name="ProgressBar_•  UI/UX"/>
+                        <wp:cNvGraphicFramePr/>
                         <a:graphic>
-                          <a:graphicData uri="http://schemas.openxmlformats.org/drawingml/2006/picture">
-                            <pic:pic>
-                              <pic:nvPicPr>
-                                <pic:cNvPr id="0" name="skill_bar_uiux.png"/>
-                                <pic:cNvPicPr/>
-                              </pic:nvPicPr>
-                              <pic:blipFill>
-                                <a:blip r:embed="rId11"/>
-                                <a:stretch>
-                                  <a:fillRect/>
-                                </a:stretch>
-                              </pic:blipFill>
-                              <pic:spPr>
+                          <a:graphicData uri="http://schemas.microsoft.com/office/word/2010/wordprocessingShape">
+                            <wps:wsp>
+                              <wps:cNvSpPr/>
+                              <wps:spPr>
                                 <a:xfrm>
                                   <a:off x="0" y="0"/>
-                                  <a:ext cx="868680" cy="100584"/>
+                                  <a:ext cx="740664" cy="118872"/>
                                 </a:xfrm>
-                                <a:prstGeom prst="rect"/>
-                              </pic:spPr>
-                            </pic:pic>
+                                <a:prstGeom prst="rect">
+                                  <a:avLst/>
+                                </a:prstGeom>
+                                <a:solidFill>
+                                  <a:srgbClr val="23272D"/>
+                                </a:solidFill>
+                                <a:ln w="12700">
+                                  <a:solidFill>
+                                    <a:srgbClr val="33373D"/>
+                                  </a:solidFill>
+                                </a:ln>
+                              </wps:spPr>
+                              <wps:bodyPr vert="horz"/>
+                            </wps:wsp>
                           </a:graphicData>
                         </a:graphic>
                       </wp:inline>
@@ -408,8 +576,8 @@
                     <w:right w:val="none"/>
                   </w:tcBorders>
                   <w:tcMar>
-                    <w:top w:w="8" w:type="dxa"/>
-                    <w:bottom w:w="8" w:type="dxa"/>
+                    <w:top w:w="6" w:type="dxa"/>
+                    <w:bottom w:w="6" w:type="dxa"/>
                     <w:left w:w="5" w:type="dxa"/>
                     <w:right w:w="5" w:type="dxa"/>
                   </w:tcMar>
@@ -438,8 +606,8 @@
                     <w:right w:val="none"/>
                   </w:tcBorders>
                   <w:tcMar>
-                    <w:top w:w="8" w:type="dxa"/>
-                    <w:bottom w:w="8" w:type="dxa"/>
+                    <w:top w:w="6" w:type="dxa"/>
+                    <w:bottom w:w="6" w:type="dxa"/>
                     <w:left w:w="5" w:type="dxa"/>
                     <w:right w:w="5" w:type="dxa"/>
                   </w:tcMar>
@@ -448,35 +616,36 @@
                   <w:pPr>
                     <w:spacing w:before="40" w:after="20"/>
                   </w:pPr>
-                  <w:r>
+                  <w:r xmlns:a="http://schemas.openxmlformats.org/drawingml/2006/main">
                     <w:drawing>
-                      <wp:inline xmlns:a="http://schemas.openxmlformats.org/drawingml/2006/main" xmlns:pic="http://schemas.openxmlformats.org/drawingml/2006/picture">
-                        <wp:extent cx="868680" cy="100584"/>
-                        <wp:docPr id="3" name="Picture 3"/>
-                        <wp:cNvGraphicFramePr>
-                          <a:graphicFrameLocks noChangeAspect="1"/>
-                        </wp:cNvGraphicFramePr>
+                      <wp:inline distT="0" distB="0" distL="0" distR="0">
+                        <wp:extent cx="777240" cy="118872"/>
+                        <wp:effectExtent l="0" t="0" r="0" b="0"/>
+                        <wp:docPr id="302" name="ProgressBar_•  Visual Design"/>
+                        <wp:cNvGraphicFramePr/>
                         <a:graphic>
-                          <a:graphicData uri="http://schemas.openxmlformats.org/drawingml/2006/picture">
-                            <pic:pic>
-                              <pic:nvPicPr>
-                                <pic:cNvPr id="0" name="skill_bar_visual.png"/>
-                                <pic:cNvPicPr/>
-                              </pic:nvPicPr>
-                              <pic:blipFill>
-                                <a:blip r:embed="rId12"/>
-                                <a:stretch>
-                                  <a:fillRect/>
-                                </a:stretch>
-                              </pic:blipFill>
-                              <pic:spPr>
+                          <a:graphicData uri="http://schemas.microsoft.com/office/word/2010/wordprocessingShape">
+                            <wps:wsp>
+                              <wps:cNvSpPr/>
+                              <wps:spPr>
                                 <a:xfrm>
                                   <a:off x="0" y="0"/>
-                                  <a:ext cx="868680" cy="100584"/>
+                                  <a:ext cx="777240" cy="118872"/>
                                 </a:xfrm>
-                                <a:prstGeom prst="rect"/>
-                              </pic:spPr>
-                            </pic:pic>
+                                <a:prstGeom prst="rect">
+                                  <a:avLst/>
+                                </a:prstGeom>
+                                <a:solidFill>
+                                  <a:srgbClr val="23272D"/>
+                                </a:solidFill>
+                                <a:ln w="12700">
+                                  <a:solidFill>
+                                    <a:srgbClr val="33373D"/>
+                                  </a:solidFill>
+                                </a:ln>
+                              </wps:spPr>
+                              <wps:bodyPr vert="horz"/>
+                            </wps:wsp>
                           </a:graphicData>
                         </a:graphic>
                       </wp:inline>
@@ -496,8 +665,8 @@
                     <w:right w:val="none"/>
                   </w:tcBorders>
                   <w:tcMar>
-                    <w:top w:w="8" w:type="dxa"/>
-                    <w:bottom w:w="8" w:type="dxa"/>
+                    <w:top w:w="6" w:type="dxa"/>
+                    <w:bottom w:w="6" w:type="dxa"/>
                     <w:left w:w="5" w:type="dxa"/>
                     <w:right w:w="5" w:type="dxa"/>
                   </w:tcMar>
@@ -526,8 +695,8 @@
                     <w:right w:val="none"/>
                   </w:tcBorders>
                   <w:tcMar>
-                    <w:top w:w="8" w:type="dxa"/>
-                    <w:bottom w:w="8" w:type="dxa"/>
+                    <w:top w:w="6" w:type="dxa"/>
+                    <w:bottom w:w="6" w:type="dxa"/>
                     <w:left w:w="5" w:type="dxa"/>
                     <w:right w:w="5" w:type="dxa"/>
                   </w:tcMar>
@@ -536,35 +705,36 @@
                   <w:pPr>
                     <w:spacing w:before="40" w:after="20"/>
                   </w:pPr>
-                  <w:r>
+                  <w:r xmlns:a="http://schemas.openxmlformats.org/drawingml/2006/main">
                     <w:drawing>
-                      <wp:inline xmlns:a="http://schemas.openxmlformats.org/drawingml/2006/main" xmlns:pic="http://schemas.openxmlformats.org/drawingml/2006/picture">
-                        <wp:extent cx="868680" cy="100584"/>
-                        <wp:docPr id="4" name="Picture 4"/>
-                        <wp:cNvGraphicFramePr>
-                          <a:graphicFrameLocks noChangeAspect="1"/>
-                        </wp:cNvGraphicFramePr>
+                      <wp:inline distT="0" distB="0" distL="0" distR="0">
+                        <wp:extent cx="649224" cy="118872"/>
+                        <wp:effectExtent l="0" t="0" r="0" b="0"/>
+                        <wp:docPr id="303" name="ProgressBar_•  User Flows"/>
+                        <wp:cNvGraphicFramePr/>
                         <a:graphic>
-                          <a:graphicData uri="http://schemas.openxmlformats.org/drawingml/2006/picture">
-                            <pic:pic>
-                              <pic:nvPicPr>
-                                <pic:cNvPr id="0" name="skill_bar_userflow.png"/>
-                                <pic:cNvPicPr/>
-                              </pic:nvPicPr>
-                              <pic:blipFill>
-                                <a:blip r:embed="rId13"/>
-                                <a:stretch>
-                                  <a:fillRect/>
-                                </a:stretch>
-                              </pic:blipFill>
-                              <pic:spPr>
+                          <a:graphicData uri="http://schemas.microsoft.com/office/word/2010/wordprocessingShape">
+                            <wps:wsp>
+                              <wps:cNvSpPr/>
+                              <wps:spPr>
                                 <a:xfrm>
                                   <a:off x="0" y="0"/>
-                                  <a:ext cx="868680" cy="100584"/>
+                                  <a:ext cx="649224" cy="118872"/>
                                 </a:xfrm>
-                                <a:prstGeom prst="rect"/>
-                              </pic:spPr>
-                            </pic:pic>
+                                <a:prstGeom prst="rect">
+                                  <a:avLst/>
+                                </a:prstGeom>
+                                <a:solidFill>
+                                  <a:srgbClr val="23272D"/>
+                                </a:solidFill>
+                                <a:ln w="12700">
+                                  <a:solidFill>
+                                    <a:srgbClr val="33373D"/>
+                                  </a:solidFill>
+                                </a:ln>
+                              </wps:spPr>
+                              <wps:bodyPr vert="horz"/>
+                            </wps:wsp>
                           </a:graphicData>
                         </a:graphic>
                       </wp:inline>
@@ -584,8 +754,8 @@
                     <w:right w:val="none"/>
                   </w:tcBorders>
                   <w:tcMar>
-                    <w:top w:w="8" w:type="dxa"/>
-                    <w:bottom w:w="8" w:type="dxa"/>
+                    <w:top w:w="6" w:type="dxa"/>
+                    <w:bottom w:w="6" w:type="dxa"/>
                     <w:left w:w="5" w:type="dxa"/>
                     <w:right w:w="5" w:type="dxa"/>
                   </w:tcMar>
@@ -614,8 +784,8 @@
                     <w:right w:val="none"/>
                   </w:tcBorders>
                   <w:tcMar>
-                    <w:top w:w="8" w:type="dxa"/>
-                    <w:bottom w:w="8" w:type="dxa"/>
+                    <w:top w:w="6" w:type="dxa"/>
+                    <w:bottom w:w="6" w:type="dxa"/>
                     <w:left w:w="5" w:type="dxa"/>
                     <w:right w:w="5" w:type="dxa"/>
                   </w:tcMar>
@@ -624,35 +794,36 @@
                   <w:pPr>
                     <w:spacing w:before="40" w:after="20"/>
                   </w:pPr>
-                  <w:r>
+                  <w:r xmlns:a="http://schemas.openxmlformats.org/drawingml/2006/main">
                     <w:drawing>
-                      <wp:inline xmlns:a="http://schemas.openxmlformats.org/drawingml/2006/main" xmlns:pic="http://schemas.openxmlformats.org/drawingml/2006/picture">
-                        <wp:extent cx="868680" cy="100584"/>
-                        <wp:docPr id="5" name="Picture 5"/>
-                        <wp:cNvGraphicFramePr>
-                          <a:graphicFrameLocks noChangeAspect="1"/>
-                        </wp:cNvGraphicFramePr>
+                      <wp:inline distT="0" distB="0" distL="0" distR="0">
+                        <wp:extent cx="694944" cy="118872"/>
+                        <wp:effectExtent l="0" t="0" r="0" b="0"/>
+                        <wp:docPr id="304" name="ProgressBar_•  Process Flows"/>
+                        <wp:cNvGraphicFramePr/>
                         <a:graphic>
-                          <a:graphicData uri="http://schemas.openxmlformats.org/drawingml/2006/picture">
-                            <pic:pic>
-                              <pic:nvPicPr>
-                                <pic:cNvPr id="0" name="skill_bar_processflow.png"/>
-                                <pic:cNvPicPr/>
-                              </pic:nvPicPr>
-                              <pic:blipFill>
-                                <a:blip r:embed="rId14"/>
-                                <a:stretch>
-                                  <a:fillRect/>
-                                </a:stretch>
-                              </pic:blipFill>
-                              <pic:spPr>
+                          <a:graphicData uri="http://schemas.microsoft.com/office/word/2010/wordprocessingShape">
+                            <wps:wsp>
+                              <wps:cNvSpPr/>
+                              <wps:spPr>
                                 <a:xfrm>
                                   <a:off x="0" y="0"/>
-                                  <a:ext cx="868680" cy="100584"/>
+                                  <a:ext cx="694944" cy="118872"/>
                                 </a:xfrm>
-                                <a:prstGeom prst="rect"/>
-                              </pic:spPr>
-                            </pic:pic>
+                                <a:prstGeom prst="rect">
+                                  <a:avLst/>
+                                </a:prstGeom>
+                                <a:solidFill>
+                                  <a:srgbClr val="23272D"/>
+                                </a:solidFill>
+                                <a:ln w="12700">
+                                  <a:solidFill>
+                                    <a:srgbClr val="33373D"/>
+                                  </a:solidFill>
+                                </a:ln>
+                              </wps:spPr>
+                              <wps:bodyPr vert="horz"/>
+                            </wps:wsp>
                           </a:graphicData>
                         </a:graphic>
                       </wp:inline>
@@ -676,7 +847,7 @@
             <w:tcMar>
               <w:top w:w="10" w:type="dxa"/>
               <w:bottom w:w="10" w:type="dxa"/>
-              <w:left w:w="60" w:type="dxa"/>
+              <w:left w:w="40" w:type="dxa"/>
               <w:right w:w="10" w:type="dxa"/>
             </w:tcMar>
           </w:tcPr>
@@ -809,17 +980,59 @@
           </w:p>
           <w:p>
             <w:pPr>
-              <w:spacing w:before="200" w:after="80" w:line="300" w:lineRule="exact"/>
-              <w:shd w:fill="23272D"/>
+              <w:spacing w:before="160" w:after="80" w:line="300" w:lineRule="exact"/>
             </w:pPr>
-            <w:r>
-              <w:rPr>
-                <w:rFonts w:ascii="Times New Roman" w:hAnsi="Times New Roman"/>
-                <w:b/>
-                <w:color w:val="FFFFFF"/>
-                <w:sz w:val="26"/>
-              </w:rPr>
-              <w:t xml:space="preserve">  Reference:  </w:t>
+            <w:r xmlns:a="http://schemas.openxmlformats.org/drawingml/2006/main">
+              <w:drawing>
+                <wp:inline distT="0" distB="0" distL="0" distR="0">
+                  <wp:extent cx="4297680" cy="310896"/>
+                  <wp:effectExtent l="0" t="0" r="0" b="0"/>
+                  <wp:docPr id="401" name="ReferenceBanner"/>
+                  <wp:cNvGraphicFramePr/>
+                  <a:graphic>
+                    <a:graphicData uri="http://schemas.microsoft.com/office/word/2010/wordprocessingShape">
+                      <wps:wsp>
+                        <wps:cNvSpPr/>
+                        <wps:spPr>
+                          <a:xfrm>
+                            <a:off x="0" y="0"/>
+                            <a:ext cx="4297680" cy="310896"/>
+                          </a:xfrm>
+                          <a:prstGeom prst="rect">
+                            <a:avLst/>
+                          </a:prstGeom>
+                          <a:solidFill>
+                            <a:srgbClr val="23272D"/>
+                          </a:solidFill>
+                          <a:ln>
+                            <a:noFill/>
+                          </a:ln>
+                        </wps:spPr>
+                        <wps:txbx>
+                          <w:txbxContent>
+                            <w:p>
+                              <w:pPr>
+                                <w:jc w:val="left"/>
+                                <w:spacing w:before="15" w:after="15"/>
+                              </w:pPr>
+                              <w:r>
+                                <w:rPr>
+                                  <w:rFonts w:ascii="Times New Roman" w:hAnsi="Times New Roman"/>
+                                  <w:b/>
+                                  <w:sz w:val="26"/>
+                                  <w:color w:val="FFFFFF"/>
+                                </w:rPr>
+                                <w:t>  Reference:  </w:t>
+                              </w:r>
+                            </w:p>
+                          </w:txbxContent>
+                        </wps:txbx>
+                        <wps:bodyPr vert="horz" lIns="100000" tIns="40000" rIns="100000" bIns="40000" anchor="ctr"/>
+                      </wps:wsp>
+                    </a:graphicData>
+                  </a:graphic>
+                </wp:inline>
+              </w:drawing>
             </w:r>
           </w:p>
           <w:p>

</xml_diff>